<commit_message>
Update mid-validation report and annexes
Revise Mid-Validation deliverables: updated ANFORA_Mid_Validation_Report_2026 (DOCX and PDF), refreshed ANFORA_Data_Collection_Mid_Validation.xlsx, and replaced annex PDFs (ENG & ESP) for Lucena coordination meeting, August 2026 outreach evidence, and Educator Webinar (2026-09-03).
</commit_message>
<xml_diff>
--- a/ANFORA_Mid_Validation_Report_2026.docx
+++ b/ANFORA_Mid_Validation_Report_2026.docx
@@ -6,6 +6,126 @@
       <w:pPr>
         <w:jc w:val="center"/>
       </w:pPr>
+      <w:r>
+        <w:rPr>
+          <w:noProof/>
+        </w:rPr>
+        <w:drawing>
+          <wp:anchor distT="0" distB="0" distL="114300" distR="114300" simplePos="0" relativeHeight="251659264" behindDoc="0" locked="0" layoutInCell="1" allowOverlap="1" wp14:anchorId="48B8228A" wp14:editId="32C36166">
+            <wp:simplePos x="0" y="0"/>
+            <wp:positionH relativeFrom="page">
+              <wp:posOffset>914400</wp:posOffset>
+            </wp:positionH>
+            <wp:positionV relativeFrom="page">
+              <wp:posOffset>9499600</wp:posOffset>
+            </wp:positionV>
+            <wp:extent cx="1841500" cy="558800"/>
+            <wp:effectExtent l="0" t="0" r="6350" b="0"/>
+            <wp:wrapNone/>
+            <wp:docPr id="2" name="Imagen 2" descr="Co-funded by the European Union"/>
+            <wp:cNvGraphicFramePr>
+              <a:graphicFrameLocks xmlns:a="http://schemas.openxmlformats.org/drawingml/2006/main" noChangeAspect="1"/>
+            </wp:cNvGraphicFramePr>
+            <a:graphic xmlns:a="http://schemas.openxmlformats.org/drawingml/2006/main">
+              <a:graphicData uri="http://schemas.openxmlformats.org/drawingml/2006/picture">
+                <pic:pic xmlns:pic="http://schemas.openxmlformats.org/drawingml/2006/picture">
+                  <pic:nvPicPr>
+                    <pic:cNvPr id="2" name="Imagen 2" descr="Co-funded by the European Union"/>
+                    <pic:cNvPicPr/>
+                  </pic:nvPicPr>
+                  <pic:blipFill>
+                    <a:blip r:embed="rId11">
+                      <a:extLst>
+                        <a:ext uri="{28A0092B-C50C-407E-A947-70E740481C1C}">
+                          <a14:useLocalDpi xmlns:a14="http://schemas.microsoft.com/office/drawing/2010/main" val="0"/>
+                        </a:ext>
+                      </a:extLst>
+                    </a:blip>
+                    <a:stretch>
+                      <a:fillRect/>
+                    </a:stretch>
+                  </pic:blipFill>
+                  <pic:spPr>
+                    <a:xfrm>
+                      <a:off x="0" y="0"/>
+                      <a:ext cx="1841500" cy="558800"/>
+                    </a:xfrm>
+                    <a:prstGeom prst="rect">
+                      <a:avLst/>
+                    </a:prstGeom>
+                  </pic:spPr>
+                </pic:pic>
+              </a:graphicData>
+            </a:graphic>
+            <wp14:sizeRelH relativeFrom="margin">
+              <wp14:pctWidth>0</wp14:pctWidth>
+            </wp14:sizeRelH>
+            <wp14:sizeRelV relativeFrom="margin">
+              <wp14:pctHeight>0</wp14:pctHeight>
+            </wp14:sizeRelV>
+          </wp:anchor>
+        </w:drawing>
+      </w:r>
+      <w:r>
+        <w:rPr>
+          <w:noProof/>
+        </w:rPr>
+        <w:drawing>
+          <wp:anchor distT="0" distB="0" distL="114300" distR="114300" simplePos="0" relativeHeight="251658240" behindDoc="0" locked="0" layoutInCell="1" allowOverlap="1" wp14:anchorId="0D3C4630" wp14:editId="440F7DDA">
+            <wp:simplePos x="0" y="0"/>
+            <wp:positionH relativeFrom="page">
+              <wp:posOffset>6223000</wp:posOffset>
+            </wp:positionH>
+            <wp:positionV relativeFrom="page">
+              <wp:posOffset>431800</wp:posOffset>
+            </wp:positionV>
+            <wp:extent cx="508000" cy="1143000"/>
+            <wp:effectExtent l="0" t="0" r="6350" b="0"/>
+            <wp:wrapNone/>
+            <wp:docPr id="1" name="Imagen 1" descr="ANFORA solution logo"/>
+            <wp:cNvGraphicFramePr>
+              <a:graphicFrameLocks xmlns:a="http://schemas.openxmlformats.org/drawingml/2006/main" noChangeAspect="1"/>
+            </wp:cNvGraphicFramePr>
+            <a:graphic xmlns:a="http://schemas.openxmlformats.org/drawingml/2006/main">
+              <a:graphicData uri="http://schemas.openxmlformats.org/drawingml/2006/picture">
+                <pic:pic xmlns:pic="http://schemas.openxmlformats.org/drawingml/2006/picture">
+                  <pic:nvPicPr>
+                    <pic:cNvPr id="1" name="Imagen 1" descr="ANFORA solution logo"/>
+                    <pic:cNvPicPr/>
+                  </pic:nvPicPr>
+                  <pic:blipFill>
+                    <a:blip r:embed="rId12">
+                      <a:extLst>
+                        <a:ext uri="{28A0092B-C50C-407E-A947-70E740481C1C}">
+                          <a14:useLocalDpi xmlns:a14="http://schemas.microsoft.com/office/drawing/2010/main" val="0"/>
+                        </a:ext>
+                      </a:extLst>
+                    </a:blip>
+                    <a:stretch>
+                      <a:fillRect/>
+                    </a:stretch>
+                  </pic:blipFill>
+                  <pic:spPr>
+                    <a:xfrm>
+                      <a:off x="0" y="0"/>
+                      <a:ext cx="508000" cy="1143000"/>
+                    </a:xfrm>
+                    <a:prstGeom prst="rect">
+                      <a:avLst/>
+                    </a:prstGeom>
+                  </pic:spPr>
+                </pic:pic>
+              </a:graphicData>
+            </a:graphic>
+            <wp14:sizeRelH relativeFrom="margin">
+              <wp14:pctWidth>0</wp14:pctWidth>
+            </wp14:sizeRelH>
+            <wp14:sizeRelV relativeFrom="margin">
+              <wp14:pctHeight>0</wp14:pctHeight>
+            </wp14:sizeRelV>
+          </wp:anchor>
+        </w:drawing>
+      </w:r>
       <w:r>
         <w:rPr>
           <w:noProof/>
@@ -26,7 +146,7 @@
                     <pic:cNvPicPr/>
                   </pic:nvPicPr>
                   <pic:blipFill>
-                    <a:blip r:embed="rId11">
+                    <a:blip r:embed="rId13">
                       <a:extLst>
                         <a:ext uri="{28A0092B-C50C-407E-A947-70E740481C1C}">
                           <a14:useLocalDpi xmlns:a14="http://schemas.microsoft.com/office/drawing/2010/main" val="0"/>
@@ -194,15 +314,7 @@
           <w:b/>
           <w:bCs/>
         </w:rPr>
-        <w:t>Actual Submission Date</w:t>
-      </w:r>
-      <w:r>
-        <w:rPr>
-          <w:rFonts w:eastAsia="Calibri" w:cs="Calibri"/>
-          <w:b/>
-          <w:bCs/>
-        </w:rPr>
-        <w:t>:</w:t>
+        <w:t>Actual Submission Date: 7 September 2026</w:t>
       </w:r>
     </w:p>
     <w:p>
@@ -258,9 +370,7 @@
           <w:rFonts w:eastAsia="Calibri" w:cs="Calibri"/>
         </w:rPr>
         <w:sectPr>
-          <w:headerReference w:type="even" r:id="rId12"/>
-          <w:headerReference w:type="default" r:id="rId13"/>
-          <w:footerReference w:type="even" r:id="rId14"/>
+          <w:headerReference w:type="default" r:id="rId14"/>
           <w:footerReference w:type="default" r:id="rId15"/>
           <w:headerReference w:type="first" r:id="rId16"/>
           <w:footerReference w:type="first" r:id="rId17"/>
@@ -340,7 +450,7 @@
           <w:r>
             <w:fldChar w:fldCharType="separate"/>
           </w:r>
-          <w:hyperlink w:anchor="_Toc239425788" w:history="1">
+          <w:hyperlink w:anchor="_Toc239673859" w:history="1">
             <w:r>
               <w:rPr>
                 <w:rStyle w:val="Hipervnculo"/>
@@ -367,7 +477,7 @@
                 <w:noProof/>
                 <w:webHidden/>
               </w:rPr>
-              <w:instrText xml:space="preserve"> PAGEREF _Toc239425788 \h </w:instrText>
+              <w:instrText xml:space="preserve"> PAGEREF _Toc239673859 \h </w:instrText>
             </w:r>
             <w:r>
               <w:rPr>
@@ -412,13 +522,13 @@
               <w:lang w:val="es-ES" w:eastAsia="es-ES"/>
             </w:rPr>
           </w:pPr>
-          <w:hyperlink w:anchor="_Toc239425789" w:history="1">
+          <w:hyperlink w:anchor="_Toc239673860" w:history="1">
             <w:r>
               <w:rPr>
                 <w:rStyle w:val="Hipervnculo"/>
                 <w:noProof/>
               </w:rPr>
-              <w:t>Glossary (if applicable)</w:t>
+              <w:t>Glossary</w:t>
             </w:r>
             <w:r>
               <w:rPr>
@@ -439,7 +549,7 @@
                 <w:noProof/>
                 <w:webHidden/>
               </w:rPr>
-              <w:instrText xml:space="preserve"> PAGEREF _Toc239425789 \h </w:instrText>
+              <w:instrText xml:space="preserve"> PAGEREF _Toc239673860 \h </w:instrText>
             </w:r>
             <w:r>
               <w:rPr>
@@ -484,13 +594,13 @@
               <w:lang w:val="es-ES" w:eastAsia="es-ES"/>
             </w:rPr>
           </w:pPr>
-          <w:hyperlink w:anchor="_Toc239425790" w:history="1">
+          <w:hyperlink w:anchor="_Toc239673861" w:history="1">
             <w:r>
               <w:rPr>
                 <w:rStyle w:val="Hipervnculo"/>
                 <w:noProof/>
               </w:rPr>
-              <w:t>1. Executive Summary (approx. 200-300 words)</w:t>
+              <w:t>1. Executive Summary</w:t>
             </w:r>
             <w:r>
               <w:rPr>
@@ -511,7 +621,7 @@
                 <w:noProof/>
                 <w:webHidden/>
               </w:rPr>
-              <w:instrText xml:space="preserve"> PAGEREF _Toc239425790 \h </w:instrText>
+              <w:instrText xml:space="preserve"> PAGEREF _Toc239673861 \h </w:instrText>
             </w:r>
             <w:r>
               <w:rPr>
@@ -556,7 +666,7 @@
               <w:lang w:val="es-ES" w:eastAsia="es-ES"/>
             </w:rPr>
           </w:pPr>
-          <w:hyperlink w:anchor="_Toc239425791" w:history="1">
+          <w:hyperlink w:anchor="_Toc239673862" w:history="1">
             <w:r>
               <w:rPr>
                 <w:rStyle w:val="Hipervnculo"/>
@@ -583,7 +693,7 @@
                 <w:noProof/>
                 <w:webHidden/>
               </w:rPr>
-              <w:instrText xml:space="preserve"> PAGEREF _Toc239425791 \h </w:instrText>
+              <w:instrText xml:space="preserve"> PAGEREF _Toc239673862 \h </w:instrText>
             </w:r>
             <w:r>
               <w:rPr>
@@ -628,7 +738,7 @@
               <w:lang w:val="es-ES" w:eastAsia="es-ES"/>
             </w:rPr>
           </w:pPr>
-          <w:hyperlink w:anchor="_Toc239425792" w:history="1">
+          <w:hyperlink w:anchor="_Toc239673863" w:history="1">
             <w:r>
               <w:rPr>
                 <w:rStyle w:val="Hipervnculo"/>
@@ -655,7 +765,7 @@
                 <w:noProof/>
                 <w:webHidden/>
               </w:rPr>
-              <w:instrText xml:space="preserve"> PAGEREF _Toc239425792 \h </w:instrText>
+              <w:instrText xml:space="preserve"> PAGEREF _Toc239673863 \h </w:instrText>
             </w:r>
             <w:r>
               <w:rPr>
@@ -700,13 +810,13 @@
               <w:lang w:val="es-ES" w:eastAsia="es-ES"/>
             </w:rPr>
           </w:pPr>
-          <w:hyperlink w:anchor="_Toc239425793" w:history="1">
+          <w:hyperlink w:anchor="_Toc239673864" w:history="1">
             <w:r>
               <w:rPr>
                 <w:rStyle w:val="Hipervnculo"/>
                 <w:noProof/>
               </w:rPr>
-              <w:t>3.1 Validation Details (approx. 300 words)</w:t>
+              <w:t>3.1 Validation Details</w:t>
             </w:r>
             <w:r>
               <w:rPr>
@@ -727,7 +837,7 @@
                 <w:noProof/>
                 <w:webHidden/>
               </w:rPr>
-              <w:instrText xml:space="preserve"> PAGEREF _Toc239425793 \h </w:instrText>
+              <w:instrText xml:space="preserve"> PAGEREF _Toc239673864 \h </w:instrText>
             </w:r>
             <w:r>
               <w:rPr>
@@ -772,13 +882,13 @@
               <w:lang w:val="es-ES" w:eastAsia="es-ES"/>
             </w:rPr>
           </w:pPr>
-          <w:hyperlink w:anchor="_Toc239425794" w:history="1">
+          <w:hyperlink w:anchor="_Toc239673865" w:history="1">
             <w:r>
               <w:rPr>
                 <w:rStyle w:val="Hipervnculo"/>
                 <w:noProof/>
               </w:rPr>
-              <w:t>3.2 Approach and Methodology (approx. 200 words)</w:t>
+              <w:t>3.2 Approach and Methodology</w:t>
             </w:r>
             <w:r>
               <w:rPr>
@@ -799,7 +909,7 @@
                 <w:noProof/>
                 <w:webHidden/>
               </w:rPr>
-              <w:instrText xml:space="preserve"> PAGEREF _Toc239425794 \h </w:instrText>
+              <w:instrText xml:space="preserve"> PAGEREF _Toc239673865 \h </w:instrText>
             </w:r>
             <w:r>
               <w:rPr>
@@ -844,13 +954,13 @@
               <w:lang w:val="es-ES" w:eastAsia="es-ES"/>
             </w:rPr>
           </w:pPr>
-          <w:hyperlink w:anchor="_Toc239425795" w:history="1">
+          <w:hyperlink w:anchor="_Toc239673866" w:history="1">
             <w:r>
               <w:rPr>
                 <w:rStyle w:val="Hipervnculo"/>
                 <w:noProof/>
               </w:rPr>
-              <w:t>3.3 Monitoring Data, evidence and Results (approx. 300 words)</w:t>
+              <w:t>3.3 Monitoring Data, evidence and Results</w:t>
             </w:r>
             <w:r>
               <w:rPr>
@@ -871,7 +981,7 @@
                 <w:noProof/>
                 <w:webHidden/>
               </w:rPr>
-              <w:instrText xml:space="preserve"> PAGEREF _Toc239425795 \h </w:instrText>
+              <w:instrText xml:space="preserve"> PAGEREF _Toc239673866 \h </w:instrText>
             </w:r>
             <w:r>
               <w:rPr>
@@ -916,13 +1026,13 @@
               <w:lang w:val="es-ES" w:eastAsia="es-ES"/>
             </w:rPr>
           </w:pPr>
-          <w:hyperlink w:anchor="_Toc239425796" w:history="1">
+          <w:hyperlink w:anchor="_Toc239673867" w:history="1">
             <w:r>
               <w:rPr>
                 <w:rStyle w:val="Hipervnculo"/>
                 <w:noProof/>
               </w:rPr>
-              <w:t>3.5 Qualitative Data and Insights (approx. 200-300 words, if applicable)</w:t>
+              <w:t>3.5 Qualitative Data and Insights</w:t>
             </w:r>
             <w:r>
               <w:rPr>
@@ -943,7 +1053,7 @@
                 <w:noProof/>
                 <w:webHidden/>
               </w:rPr>
-              <w:instrText xml:space="preserve"> PAGEREF _Toc239425796 \h </w:instrText>
+              <w:instrText xml:space="preserve"> PAGEREF _Toc239673867 \h </w:instrText>
             </w:r>
             <w:r>
               <w:rPr>
@@ -963,7 +1073,7 @@
                 <w:noProof/>
                 <w:webHidden/>
               </w:rPr>
-              <w:t>7</w:t>
+              <w:t>8</w:t>
             </w:r>
             <w:r>
               <w:rPr>
@@ -988,13 +1098,13 @@
               <w:lang w:val="es-ES" w:eastAsia="es-ES"/>
             </w:rPr>
           </w:pPr>
-          <w:hyperlink w:anchor="_Toc239425797" w:history="1">
+          <w:hyperlink w:anchor="_Toc239673868" w:history="1">
             <w:r>
               <w:rPr>
                 <w:rStyle w:val="Hipervnculo"/>
                 <w:noProof/>
               </w:rPr>
-              <w:t>3.6 Challenges and Mitigation (approx. 1-2 sentences per cell)</w:t>
+              <w:t>3.6 Challenges and Mitigation</w:t>
             </w:r>
             <w:r>
               <w:rPr>
@@ -1015,7 +1125,7 @@
                 <w:noProof/>
                 <w:webHidden/>
               </w:rPr>
-              <w:instrText xml:space="preserve"> PAGEREF _Toc239425797 \h </w:instrText>
+              <w:instrText xml:space="preserve"> PAGEREF _Toc239673868 \h </w:instrText>
             </w:r>
             <w:r>
               <w:rPr>
@@ -1060,13 +1170,13 @@
               <w:lang w:val="es-ES" w:eastAsia="es-ES"/>
             </w:rPr>
           </w:pPr>
-          <w:hyperlink w:anchor="_Toc239425798" w:history="1">
+          <w:hyperlink w:anchor="_Toc239673869" w:history="1">
             <w:r>
               <w:rPr>
                 <w:rStyle w:val="Hipervnculo"/>
                 <w:noProof/>
               </w:rPr>
-              <w:t>5. Conclusions and Next Steps (200 words)</w:t>
+              <w:t>5. Conclusions and Next Steps</w:t>
             </w:r>
             <w:r>
               <w:rPr>
@@ -1087,7 +1197,7 @@
                 <w:noProof/>
                 <w:webHidden/>
               </w:rPr>
-              <w:instrText xml:space="preserve"> PAGEREF _Toc239425798 \h </w:instrText>
+              <w:instrText xml:space="preserve"> PAGEREF _Toc239673869 \h </w:instrText>
             </w:r>
             <w:r>
               <w:rPr>
@@ -1132,13 +1242,13 @@
               <w:lang w:val="es-ES" w:eastAsia="es-ES"/>
             </w:rPr>
           </w:pPr>
-          <w:hyperlink w:anchor="_Toc239425799" w:history="1">
+          <w:hyperlink w:anchor="_Toc239673870" w:history="1">
             <w:r>
               <w:rPr>
                 <w:rStyle w:val="Hipervnculo"/>
                 <w:noProof/>
               </w:rPr>
-              <w:t>6. Annexes (if applicable)</w:t>
+              <w:t>6. Annexes</w:t>
             </w:r>
             <w:r>
               <w:rPr>
@@ -1159,7 +1269,7 @@
                 <w:noProof/>
                 <w:webHidden/>
               </w:rPr>
-              <w:instrText xml:space="preserve"> PAGEREF _Toc239425799 \h </w:instrText>
+              <w:instrText xml:space="preserve"> PAGEREF _Toc239673870 \h </w:instrText>
             </w:r>
             <w:r>
               <w:rPr>
@@ -1204,7 +1314,7 @@
       </w:pPr>
       <w:bookmarkStart w:id="0" w:name="_Toc93859176"/>
       <w:bookmarkStart w:id="1" w:name="_Toc1231297725"/>
-      <w:bookmarkStart w:id="2" w:name="_Toc239425788"/>
+      <w:bookmarkStart w:id="2" w:name="_Toc239673859"/>
       <w:r>
         <w:t>Table of Figures</w:t>
       </w:r>
@@ -1220,35 +1330,9 @@
       </w:pPr>
       <w:r>
         <w:rPr>
-          <w:color w:val="FF0000"/>
+          <w:color w:val="000000"/>
         </w:rPr>
-        <w:fldChar w:fldCharType="begin"/>
-      </w:r>
-      <w:r>
-        <w:rPr>
-          <w:color w:val="FF0000"/>
-        </w:rPr>
-        <w:instrText xml:space="preserve"> TOC \h \z \c "Figure" </w:instrText>
-      </w:r>
-      <w:r>
-        <w:rPr>
-          <w:color w:val="FF0000"/>
-        </w:rPr>
-        <w:fldChar w:fldCharType="separate"/>
-      </w:r>
-      <w:r>
-        <w:rPr>
-          <w:b/>
-          <w:bCs/>
-          <w:color w:val="FF0000"/>
-        </w:rPr>
-        <w:t>No table of figures entries found.</w:t>
-      </w:r>
-      <w:r>
-        <w:rPr>
-          <w:color w:val="FF0000"/>
-        </w:rPr>
-        <w:fldChar w:fldCharType="end"/>
+        <w:t>Not applicable.</w:t>
       </w:r>
     </w:p>
     <w:p>
@@ -1257,15 +1341,9 @@
       </w:pPr>
       <w:bookmarkStart w:id="3" w:name="_Toc660834351"/>
       <w:bookmarkStart w:id="4" w:name="_Toc1768055108"/>
-      <w:bookmarkStart w:id="5" w:name="_Toc239425789"/>
-      <w:r>
-        <w:t xml:space="preserve">Glossary (if </w:t>
-      </w:r>
-      <w:r>
-        <w:t>applicable</w:t>
-      </w:r>
-      <w:r>
-        <w:t>)</w:t>
+      <w:bookmarkStart w:id="5" w:name="_Toc239673860"/>
+      <w:r>
+        <w:t>Glossary</w:t>
       </w:r>
       <w:bookmarkEnd w:id="3"/>
       <w:bookmarkEnd w:id="4"/>
@@ -1300,22 +1378,10 @@
         <w:pStyle w:val="Ttulo3"/>
         <w:spacing w:line="276" w:lineRule="auto"/>
       </w:pPr>
-      <w:bookmarkStart w:id="7" w:name="_Toc239425790"/>
+      <w:bookmarkStart w:id="7" w:name="_Toc239673861"/>
       <w:r>
         <w:lastRenderedPageBreak/>
-        <w:t>1</w:t>
-      </w:r>
-      <w:r>
-        <w:t>.</w:t>
-      </w:r>
-      <w:r>
-        <w:t xml:space="preserve"> </w:t>
-      </w:r>
-      <w:r>
-        <w:t>Executive Summary</w:t>
-      </w:r>
-      <w:r>
-        <w:t xml:space="preserve"> (approx. 200-300 words)</w:t>
+        <w:t>1. Executive Summary</w:t>
       </w:r>
       <w:bookmarkEnd w:id="6"/>
       <w:bookmarkEnd w:id="7"/>
@@ -1334,7 +1400,7 @@
         <w:spacing w:line="276" w:lineRule="auto"/>
       </w:pPr>
       <w:bookmarkStart w:id="8" w:name="_Toc928034533"/>
-      <w:bookmarkStart w:id="9" w:name="_Toc239425791"/>
+      <w:bookmarkStart w:id="9" w:name="_Toc239673862"/>
       <w:r>
         <w:t>2</w:t>
       </w:r>
@@ -1612,7 +1678,7 @@
                 <w:sz w:val="22"/>
                 <w:szCs w:val="22"/>
               </w:rPr>
-              <w:t>Not measured</w:t>
+              <w:t>Delayed</w:t>
             </w:r>
           </w:p>
         </w:tc>
@@ -1736,7 +1802,7 @@
                 <w:sz w:val="22"/>
                 <w:szCs w:val="22"/>
               </w:rPr>
-              <w:t>Completed (live-site MoV)</w:t>
+              <w:t>Completed</w:t>
             </w:r>
           </w:p>
         </w:tc>
@@ -1860,7 +1926,7 @@
                 <w:sz w:val="22"/>
                 <w:szCs w:val="22"/>
               </w:rPr>
-              <w:t>Not verified</w:t>
+              <w:t>In Progress</w:t>
             </w:r>
           </w:p>
         </w:tc>
@@ -1931,7 +1997,7 @@
       </w:pPr>
       <w:bookmarkStart w:id="10" w:name="_Toc42010343"/>
       <w:bookmarkStart w:id="11" w:name="_Toc876588116"/>
-      <w:bookmarkStart w:id="12" w:name="_Toc239425792"/>
+      <w:bookmarkStart w:id="12" w:name="_Toc239673863"/>
       <w:r>
         <w:t xml:space="preserve">3. </w:t>
       </w:r>
@@ -1954,24 +2020,9 @@
         <w:spacing w:line="276" w:lineRule="auto"/>
       </w:pPr>
       <w:bookmarkStart w:id="13" w:name="_Toc962990624"/>
-      <w:bookmarkStart w:id="14" w:name="_Toc239425793"/>
-      <w:r>
-        <w:t>3.</w:t>
-      </w:r>
-      <w:r>
-        <w:t>1</w:t>
-      </w:r>
-      <w:r>
-        <w:t xml:space="preserve"> </w:t>
-      </w:r>
-      <w:r>
-        <w:t xml:space="preserve">Validation </w:t>
-      </w:r>
-      <w:r>
-        <w:t>Details</w:t>
-      </w:r>
-      <w:r>
-        <w:t xml:space="preserve"> (approx. 300 words)</w:t>
+      <w:bookmarkStart w:id="14" w:name="_Toc239673864"/>
+      <w:r>
+        <w:t>3.1 Validation Details</w:t>
       </w:r>
       <w:bookmarkEnd w:id="13"/>
       <w:bookmarkEnd w:id="14"/>
@@ -2183,10 +2234,10 @@
         <w:pStyle w:val="Ttulo4"/>
         <w:spacing w:line="276" w:lineRule="auto"/>
       </w:pPr>
-      <w:bookmarkStart w:id="15" w:name="_Toc239425794"/>
+      <w:bookmarkStart w:id="15" w:name="_Toc239673865"/>
       <w:r>
         <w:lastRenderedPageBreak/>
-        <w:t>3.2 Approach and Methodology (approx. 200 words)</w:t>
+        <w:t>3.2 Approach and Methodology</w:t>
       </w:r>
       <w:bookmarkEnd w:id="15"/>
     </w:p>
@@ -2309,37 +2360,10 @@
         <w:spacing w:line="276" w:lineRule="auto"/>
       </w:pPr>
       <w:bookmarkStart w:id="16" w:name="_Toc1000251624"/>
-      <w:bookmarkStart w:id="17" w:name="_Toc239425795"/>
+      <w:bookmarkStart w:id="17" w:name="_Toc239673866"/>
       <w:r>
         <w:lastRenderedPageBreak/>
-        <w:t>3.</w:t>
-      </w:r>
-      <w:r>
-        <w:t xml:space="preserve">3 </w:t>
-      </w:r>
-      <w:r>
-        <w:t>Monitoring Da</w:t>
-      </w:r>
-      <w:r>
-        <w:t>t</w:t>
-      </w:r>
-      <w:r>
-        <w:t>a, evidence and Results</w:t>
-      </w:r>
-      <w:r>
-        <w:t xml:space="preserve"> </w:t>
-      </w:r>
-      <w:r>
-        <w:t>(</w:t>
-      </w:r>
-      <w:r>
-        <w:t xml:space="preserve">approx. </w:t>
-      </w:r>
-      <w:r>
-        <w:t>300 words</w:t>
-      </w:r>
-      <w:r>
-        <w:t>)</w:t>
+        <w:t>3.3 Monitoring Data, evidence and Results</w:t>
       </w:r>
       <w:bookmarkEnd w:id="16"/>
       <w:bookmarkEnd w:id="17"/>
@@ -4868,16 +4892,10 @@
         <w:pStyle w:val="Ttulo4"/>
         <w:spacing w:line="276" w:lineRule="auto"/>
       </w:pPr>
-      <w:bookmarkStart w:id="18" w:name="_Toc239425796"/>
+      <w:bookmarkStart w:id="18" w:name="_Toc239673867"/>
       <w:r>
         <w:lastRenderedPageBreak/>
-        <w:t>3.5 Qualitative Data and Insights (approx. 200-300 words</w:t>
-      </w:r>
-      <w:r>
-        <w:t>, if applicable</w:t>
-      </w:r>
-      <w:r>
-        <w:t>)</w:t>
+        <w:t>3.5 Qualitative Data and Insights</w:t>
       </w:r>
       <w:bookmarkEnd w:id="18"/>
     </w:p>
@@ -4903,24 +4921,9 @@
         <w:spacing w:line="276" w:lineRule="auto"/>
       </w:pPr>
       <w:bookmarkStart w:id="19" w:name="_Toc1593654723"/>
-      <w:bookmarkStart w:id="20" w:name="_Toc239425797"/>
-      <w:r>
-        <w:t>3.</w:t>
-      </w:r>
-      <w:r>
-        <w:t>6</w:t>
-      </w:r>
-      <w:r>
-        <w:t xml:space="preserve"> Challenges and Mitigation</w:t>
-      </w:r>
-      <w:r>
-        <w:t xml:space="preserve"> (approx. </w:t>
-      </w:r>
-      <w:r>
-        <w:t>1-2 sentences per cell</w:t>
-      </w:r>
-      <w:r>
-        <w:t>)</w:t>
+      <w:bookmarkStart w:id="20" w:name="_Toc239673868"/>
+      <w:r>
+        <w:t>3.6 Challenges and Mitigation</w:t>
       </w:r>
       <w:bookmarkEnd w:id="19"/>
       <w:bookmarkEnd w:id="20"/>
@@ -5026,7 +5029,6 @@
         <w:tc>
           <w:tcPr>
             <w:tcW w:w="2979" w:type="dxa"/>
-            <w:vMerge w:val="restart"/>
             <w:vAlign w:val="center"/>
           </w:tcPr>
           <w:p>
@@ -5039,14 +5041,13 @@
                 <w:b/>
                 <w:bCs/>
               </w:rPr>
-              <w:t>Technical challenges</w:t>
+              <w:t>Technical Challenges</w:t>
             </w:r>
           </w:p>
         </w:tc>
         <w:tc>
           <w:tcPr>
             <w:tcW w:w="1641" w:type="dxa"/>
-            <w:vMerge w:val="restart"/>
             <w:vAlign w:val="center"/>
           </w:tcPr>
           <w:p>
@@ -5070,7 +5071,7 @@
               <w:jc w:val="left"/>
             </w:pPr>
             <w:r>
-              <w:t>PostHog was introduced on 31 August and no auditable period export or classified user dataset was available.</w:t>
+              <w:t>PostHog was introduced on 31 August, so no auditable period analytics export or classified user dataset was available; PWA assets exist, but service-worker registration and full offline behaviour were not conclusively verified. Mitigation: export consent-based analytics, govern account eligibility and QA/test exclusions, test service-worker registration, and retain the results.</w:t>
             </w:r>
           </w:p>
         </w:tc>
@@ -5079,20 +5080,26 @@
         <w:tc>
           <w:tcPr>
             <w:tcW w:w="2979" w:type="dxa"/>
-            <w:vMerge/>
-          </w:tcPr>
-          <w:p/>
+          </w:tcPr>
+          <w:p>
+            <w:r>
+              <w:lastRenderedPageBreak/>
+              <w:t>Operational/Logistical Challenges</w:t>
+            </w:r>
+          </w:p>
         </w:tc>
         <w:tc>
           <w:tcPr>
             <w:tcW w:w="1641" w:type="dxa"/>
-            <w:vMerge/>
             <w:vAlign w:val="center"/>
           </w:tcPr>
           <w:p>
             <w:pPr>
               <w:jc w:val="center"/>
             </w:pPr>
+            <w:r>
+              <w:t>YES</w:t>
+            </w:r>
           </w:p>
         </w:tc>
         <w:tc>
@@ -5106,7 +5113,7 @@
               <w:jc w:val="left"/>
             </w:pPr>
             <w:r>
-              <w:t>Code contains PWA assets, but effective service-worker registration and full offline behaviour were not conclusively verified.</w:t>
+              <w:t>No in-period attendance register or survey-response export was available; the 3 September webinar is verified only post-cut-off, and the full 27 August Lucena-school recipient set remains incomplete, preventing in-period participation and satisfaction verification. Mitigation: retain dated agendas/minutes, recipient and delivery logs, unique attendance registers, instrument versions and response exports with denominators.</w:t>
             </w:r>
           </w:p>
         </w:tc>
@@ -5115,20 +5122,25 @@
         <w:tc>
           <w:tcPr>
             <w:tcW w:w="2979" w:type="dxa"/>
-            <w:vMerge/>
-          </w:tcPr>
-          <w:p/>
+          </w:tcPr>
+          <w:p>
+            <w:r>
+              <w:t>Coordination/Collaboration Challenges</w:t>
+            </w:r>
+          </w:p>
         </w:tc>
         <w:tc>
           <w:tcPr>
             <w:tcW w:w="1641" w:type="dxa"/>
-            <w:vMerge/>
             <w:vAlign w:val="center"/>
           </w:tcPr>
           <w:p>
             <w:pPr>
               <w:jc w:val="center"/>
             </w:pPr>
+            <w:r>
+              <w:t>YES</w:t>
+            </w:r>
           </w:p>
         </w:tc>
         <w:tc>
@@ -5142,7 +5154,7 @@
               <w:jc w:val="left"/>
             </w:pPr>
             <w:r>
-              <w:t>Export consent-based analytics, add auditable account-eligibility governance, test service-worker registration and retain QA/test exclusion rules.</w:t>
+              <w:t>The 5 August meeting and June mass outreach are source-backed, and specific 27 August invitations are documented, but the reported total of 10 Lucena schools is not fully verified, limiting the outreach claim. Mitigation: retain the meeting and outreach records and recover complete recipient-level evidence for the remaining 27 August claim and later participation.</w:t>
             </w:r>
           </w:p>
         </w:tc>
@@ -5151,7 +5163,6 @@
         <w:tc>
           <w:tcPr>
             <w:tcW w:w="2979" w:type="dxa"/>
-            <w:vMerge w:val="restart"/>
             <w:vAlign w:val="center"/>
           </w:tcPr>
           <w:p>
@@ -5168,15 +5179,13 @@
                 <w:b/>
                 <w:bCs/>
               </w:rPr>
-              <w:lastRenderedPageBreak/>
-              <w:t>Operational/logistical challenges</w:t>
+              <w:t>Others</w:t>
             </w:r>
           </w:p>
         </w:tc>
         <w:tc>
           <w:tcPr>
             <w:tcW w:w="1641" w:type="dxa"/>
-            <w:vMerge w:val="restart"/>
             <w:vAlign w:val="center"/>
           </w:tcPr>
           <w:p>
@@ -5200,244 +5209,7 @@
               <w:jc w:val="left"/>
             </w:pPr>
             <w:r>
-              <w:t>No in-period attendance register or survey-response export was available. The 3 September webinar is verified but post-cut-off; the full 27 August Lucena-school recipient set remains incomplete.</w:t>
-            </w:r>
-          </w:p>
-        </w:tc>
-      </w:tr>
-      <w:tr>
-        <w:tc>
-          <w:tcPr>
-            <w:tcW w:w="2979" w:type="dxa"/>
-            <w:vMerge/>
-            <w:vAlign w:val="center"/>
-          </w:tcPr>
-          <w:p>
-            <w:pPr>
-              <w:jc w:val="left"/>
-            </w:pPr>
-          </w:p>
-        </w:tc>
-        <w:tc>
-          <w:tcPr>
-            <w:tcW w:w="1641" w:type="dxa"/>
-            <w:vMerge/>
-            <w:vAlign w:val="center"/>
-          </w:tcPr>
-          <w:p>
-            <w:pPr>
-              <w:jc w:val="center"/>
-            </w:pPr>
-          </w:p>
-        </w:tc>
-        <w:tc>
-          <w:tcPr>
-            <w:tcW w:w="4595" w:type="dxa"/>
-            <w:vAlign w:val="center"/>
-          </w:tcPr>
-          <w:p>
-            <w:pPr>
-              <w:spacing w:line="276" w:lineRule="auto"/>
-              <w:jc w:val="left"/>
-            </w:pPr>
-            <w:r>
-              <w:t>Use dated agendas/minutes, recipient and delivery logs, unique attendance registers, instrument versions and response exports with denominators.</w:t>
-            </w:r>
-          </w:p>
-        </w:tc>
-      </w:tr>
-      <w:tr>
-        <w:tc>
-          <w:tcPr>
-            <w:tcW w:w="2979" w:type="dxa"/>
-            <w:vMerge w:val="restart"/>
-            <w:vAlign w:val="center"/>
-          </w:tcPr>
-          <w:p>
-            <w:pPr>
-              <w:spacing w:line="276" w:lineRule="auto"/>
-              <w:jc w:val="left"/>
-              <w:rPr>
-                <w:b/>
-                <w:bCs/>
-              </w:rPr>
-            </w:pPr>
-            <w:r>
-              <w:rPr>
-                <w:b/>
-                <w:bCs/>
-              </w:rPr>
-              <w:t>Coordination/collaboration challenges</w:t>
-            </w:r>
-          </w:p>
-        </w:tc>
-        <w:tc>
-          <w:tcPr>
-            <w:tcW w:w="1641" w:type="dxa"/>
-            <w:vMerge w:val="restart"/>
-            <w:vAlign w:val="center"/>
-          </w:tcPr>
-          <w:p>
-            <w:pPr>
-              <w:spacing w:line="276" w:lineRule="auto"/>
-              <w:jc w:val="center"/>
-            </w:pPr>
-            <w:r>
-              <w:t>YES</w:t>
-            </w:r>
-          </w:p>
-        </w:tc>
-        <w:tc>
-          <w:tcPr>
-            <w:tcW w:w="4595" w:type="dxa"/>
-            <w:vAlign w:val="center"/>
-          </w:tcPr>
-          <w:p>
-            <w:pPr>
-              <w:spacing w:line="276" w:lineRule="auto"/>
-              <w:jc w:val="left"/>
-            </w:pPr>
-            <w:r>
-              <w:t>The 5 August meeting and June mass outreach are source-backed. Specific 27 August invitations are also documented, but the reported total of 10 Lucena schools is not fully verified.</w:t>
-            </w:r>
-          </w:p>
-        </w:tc>
-      </w:tr>
-      <w:tr>
-        <w:tc>
-          <w:tcPr>
-            <w:tcW w:w="2979" w:type="dxa"/>
-            <w:vMerge/>
-            <w:vAlign w:val="center"/>
-          </w:tcPr>
-          <w:p>
-            <w:pPr>
-              <w:jc w:val="left"/>
-            </w:pPr>
-          </w:p>
-        </w:tc>
-        <w:tc>
-          <w:tcPr>
-            <w:tcW w:w="1641" w:type="dxa"/>
-            <w:vMerge/>
-            <w:vAlign w:val="center"/>
-          </w:tcPr>
-          <w:p>
-            <w:pPr>
-              <w:jc w:val="center"/>
-            </w:pPr>
-          </w:p>
-        </w:tc>
-        <w:tc>
-          <w:tcPr>
-            <w:tcW w:w="4595" w:type="dxa"/>
-            <w:vAlign w:val="center"/>
-          </w:tcPr>
-          <w:p>
-            <w:pPr>
-              <w:spacing w:line="276" w:lineRule="auto"/>
-              <w:jc w:val="left"/>
-            </w:pPr>
-            <w:r>
-              <w:t>Retain the meeting and outreach records, and recover the complete recipient-level evidence for the remaining 27 August Lucena-school claim and later participation.</w:t>
-            </w:r>
-          </w:p>
-        </w:tc>
-      </w:tr>
-      <w:tr>
-        <w:tc>
-          <w:tcPr>
-            <w:tcW w:w="2979" w:type="dxa"/>
-            <w:vMerge w:val="restart"/>
-            <w:vAlign w:val="center"/>
-          </w:tcPr>
-          <w:p>
-            <w:pPr>
-              <w:spacing w:line="276" w:lineRule="auto"/>
-              <w:jc w:val="left"/>
-              <w:rPr>
-                <w:b/>
-                <w:bCs/>
-              </w:rPr>
-            </w:pPr>
-            <w:r>
-              <w:rPr>
-                <w:b/>
-                <w:bCs/>
-              </w:rPr>
-              <w:t>Other</w:t>
-            </w:r>
-          </w:p>
-        </w:tc>
-        <w:tc>
-          <w:tcPr>
-            <w:tcW w:w="1641" w:type="dxa"/>
-            <w:vMerge w:val="restart"/>
-            <w:vAlign w:val="center"/>
-          </w:tcPr>
-          <w:p>
-            <w:pPr>
-              <w:spacing w:line="276" w:lineRule="auto"/>
-              <w:jc w:val="center"/>
-            </w:pPr>
-            <w:r>
-              <w:t>YES</w:t>
-            </w:r>
-          </w:p>
-        </w:tc>
-        <w:tc>
-          <w:tcPr>
-            <w:tcW w:w="4595" w:type="dxa"/>
-            <w:vAlign w:val="center"/>
-          </w:tcPr>
-          <w:p>
-            <w:pPr>
-              <w:spacing w:line="276" w:lineRule="auto"/>
-              <w:jc w:val="left"/>
-            </w:pPr>
-            <w:r>
-              <w:t>WEI+, irrigation energy, green employment and behavioural savings require separate attributable baselines and cannot be inferred from platform availability.</w:t>
-            </w:r>
-          </w:p>
-        </w:tc>
-      </w:tr>
-      <w:tr>
-        <w:tc>
-          <w:tcPr>
-            <w:tcW w:w="2979" w:type="dxa"/>
-            <w:vMerge/>
-            <w:vAlign w:val="center"/>
-          </w:tcPr>
-          <w:p>
-            <w:pPr>
-              <w:jc w:val="left"/>
-            </w:pPr>
-          </w:p>
-        </w:tc>
-        <w:tc>
-          <w:tcPr>
-            <w:tcW w:w="1641" w:type="dxa"/>
-            <w:vMerge/>
-            <w:vAlign w:val="center"/>
-          </w:tcPr>
-          <w:p>
-            <w:pPr>
-              <w:jc w:val="center"/>
-            </w:pPr>
-          </w:p>
-        </w:tc>
-        <w:tc>
-          <w:tcPr>
-            <w:tcW w:w="4595" w:type="dxa"/>
-            <w:vAlign w:val="center"/>
-          </w:tcPr>
-          <w:p>
-            <w:pPr>
-              <w:spacing w:line="276" w:lineRule="auto"/>
-              <w:jc w:val="left"/>
-            </w:pPr>
-            <w:r>
-              <w:t>Keep these indicators Not measured/Not verified until evidence exists, and obtain written approval before changing definitions or targets.</w:t>
+              <w:t>WEI+, irrigation energy, green employment and behavioural savings require separate attributable baselines and cannot be inferred from platform availability; without them, those indicators cannot be measured or verified. Mitigation: keep their indicator results Not measured/Not verified until evidence exists and obtain written approval before changing definitions or targets.</w:t>
             </w:r>
           </w:p>
         </w:tc>
@@ -5479,21 +5251,9 @@
         <w:spacing w:line="276" w:lineRule="auto"/>
       </w:pPr>
       <w:bookmarkStart w:id="21" w:name="_Toc1714447049"/>
-      <w:bookmarkStart w:id="22" w:name="_Toc239425798"/>
-      <w:r>
-        <w:t>5</w:t>
-      </w:r>
-      <w:r>
-        <w:t>.</w:t>
-      </w:r>
-      <w:r>
-        <w:t xml:space="preserve"> </w:t>
-      </w:r>
-      <w:r>
-        <w:t>Conclusions and Next Steps</w:t>
-      </w:r>
-      <w:r>
-        <w:t xml:space="preserve"> (200 words)</w:t>
+      <w:bookmarkStart w:id="22" w:name="_Toc239673869"/>
+      <w:r>
+        <w:t>5. Conclusions and Next Steps</w:t>
       </w:r>
       <w:bookmarkEnd w:id="21"/>
       <w:bookmarkEnd w:id="22"/>
@@ -5503,11 +5263,11 @@
         <w:spacing w:line="276" w:lineRule="auto"/>
       </w:pPr>
       <w:r>
-        <w:t xml:space="preserve">ANFORA is verified as a publicly reachable, web-based water-footprint platform with authentication, product exploration, recipe calculation, personal recipes, weekly menus and Spanish/English resources. Code and data support the green, blue, grey, total and per-serving calculations and the stated catalogue/content counts. Documentary evidence supports the existence of 12 bilingual training units, 24 earlier interview/questionnaire forms and the 5 August coordination meeting, including participation by two identified municipal representatives and planning for schools, urban gardens and two webinar audiences. The signed amendment was not provided. Email evidence verifies the June mass campaign and specific 27 August invitations, while the exact 10-school Lucena claim remains partially verified. A corrected communication and dated meeting notes/transcript verify that the educator webinar was delivered on 3 September 2026, with live demonstration and attendee </w:t>
+        <w:t xml:space="preserve">ANFORA is verified as a publicly reachable, web-based water-footprint platform with authentication, product exploration, recipe calculation, personal recipes, weekly menus and Spanish/English resources. Code and data support the green, blue, grey, total and per-serving calculations and the stated catalogue/content counts. Documentary evidence supports the existence of 12 bilingual training units, 24 earlier interview/questionnaire forms and the 5 August coordination meeting, including participation by two identified municipal representatives and planning for schools, urban gardens and two webinar audiences. The signed amendment was not provided. Email evidence verifies the June mass campaign and specific 27 August invitations, </w:t>
       </w:r>
       <w:r>
         <w:lastRenderedPageBreak/>
-        <w:t>interaction. Because this occurred after the 31 August reporting cut-off, it is documented as a post-cut-off development only; no complete validated attendance register or satisfaction dataset was available. The reviewed evidence still does not demonstrate that users were satisfied, that 100 eligible external users registered, or that all reported local-school outreach counts were achieved. Accordingly, KPI14 is Not measured and KPI16 is Not verified. The indicator workbook reports NBS15.1, NBS24.18, RRTG.SC-01b and INNOV_003 as Not verified; NBS4.20, INNOV_002 and INNOV_004 as Not measured; and INNOV_005/006 as Not assessable. Next steps are to obtain the contractual amendment and complete local-school recipient record, establish account eligibility, export consent-based analytics, retain complete unique-attendance records and administer validated pre/post and satisfaction questionnaires. Farm/HR/contextual indicators require their own dated baselines and follow-up sources. No missing result is reported as zero, and post-cut-off activity is clearly separated.</w:t>
+        <w:t>while the exact 10-school Lucena claim remains partially verified. A corrected communication and dated meeting notes/transcript verify that the educator webinar was delivered on 3 September 2026, with live demonstration and attendee interaction. Because this occurred after the 31 August reporting cut-off, it is documented as a post-cut-off development only; no complete validated attendance register or satisfaction dataset was available. The reviewed evidence still does not demonstrate that users were satisfied, that 100 eligible external users registered, or that all reported local-school outreach counts were achieved. Accordingly, KPI14 is Not measured and KPI16 is Not verified. The indicator workbook reports NBS15.1, NBS24.18, RRTG.SC-01b and INNOV_003 as Not verified; NBS4.20, INNOV_002 and INNOV_004 as Not measured; and INNOV_005/006 as Not assessable. Next steps are to obtain the contractual amendment and complete local-school recipient record, establish account eligibility, export consent-based analytics, retain complete unique-attendance records and administer validated pre/post and satisfaction questionnaires. Farm/HR/contextual indicators require their own dated baselines and follow-up sources. No missing result is reported as zero, and post-cut-off activity is clearly separated.</w:t>
       </w:r>
     </w:p>
     <w:p>
@@ -5516,9 +5276,9 @@
         <w:spacing w:line="276" w:lineRule="auto"/>
       </w:pPr>
       <w:bookmarkStart w:id="23" w:name="_Toc1517815904"/>
-      <w:bookmarkStart w:id="24" w:name="_Toc239425799"/>
-      <w:r>
-        <w:t>6. Annexes (if applicable)</w:t>
+      <w:bookmarkStart w:id="24" w:name="_Toc239673870"/>
+      <w:r>
+        <w:t>6. Annexes</w:t>
       </w:r>
       <w:bookmarkEnd w:id="23"/>
       <w:bookmarkEnd w:id="24"/>
@@ -5551,7 +5311,7 @@
         <w:spacing w:after="120"/>
       </w:pPr>
       <w:r>
-        <w:t>A1 — Evidence: ANFORA technical proposal: Otros\Doc\Propuesta ANFORA.pdf. Signed November 2025 amendment not located. Period / status: Proposal located; amendment not provided Use in validation: Proposal supports planned KPIs/activities. Payment 3 amendment wording and signature are not independently verified.</w:t>
+        <w:t>A1 — Evidence: Annex A1 – ANFORA Technical Proposal. Signed November 2025 amendment not located. Period / status: Proposal located; amendment not provided Use in validation: Proposal supports planned KPIs/activities. Payment 3 amendment wording and signature are not independently verified.</w:t>
       </w:r>
     </w:p>
     <w:p>
@@ -5567,7 +5327,7 @@
         <w:spacing w:after="120"/>
       </w:pPr>
       <w:r>
-        <w:t>A3 — Evidence: 24 scanned Lucena interview/questionnaire forms in Otros\Anfora (Lucena)\Entrevistas Period / status: Background; stored 21 November 2025; contains personal data Use in validation: Documents earlier needs-assessment responses. Contradicts “25–30”: only 24 files were located. Not KPI14 evidence.</w:t>
+        <w:t>A3 — Evidence: 24 scanned Lucena interview/questionnaire forms. Retained in controlled project storage. Period / status: Background; stored 21 November 2025; contains personal data Use in validation: Documents earlier needs-assessment responses. Contradicts ‘25–30’: only 24 files were located. Not KPI14 evidence.</w:t>
       </w:r>
     </w:p>
     <w:p>
@@ -5575,11 +5335,8 @@
         <w:spacing w:after="120"/>
       </w:pPr>
       <w:r>
-        <w:t xml:space="preserve">A4 — Evidence: 12 bilingual units in Otros\Training\ESP and \ENG; Spanish user manual; Unit 06 questionnaire content Period / status: Located; April 2026 materials; </w:t>
-      </w:r>
-      <w:r>
         <w:lastRenderedPageBreak/>
-        <w:t>attendance not provided Use in validation: Verifies bilingual material/questionnaire readiness only. Some material claims require technical/funder review.</w:t>
+        <w:t>A4 — Evidence: 12 bilingual units, the Spanish user manual and Unit 06 questionnaire content. Retained in controlled project storage. Period / status: Located; April 2026 materials; attendance not provided Use in validation: Verifies bilingual material/questionnaire readiness only. Some material claims require technical/funder review.</w:t>
       </w:r>
     </w:p>
     <w:p>
@@ -5587,7 +5344,7 @@
         <w:spacing w:after="120"/>
       </w:pPr>
       <w:r>
-        <w:t>A5 — Evidence: Lucena Environment Department / Evenor-Tech / BALAM coordination meeting: summary and timestamped transcript Period / status: Located; dated 5 August 2026; source records contain participant names and meeting transcript details Use in validation: Verifies the 5 August coordination meeting, participation by two identified municipal representatives, discussion of school and urban-garden use cases, municipal dissemination and separate webinar formats for educators and the general public. Does not prove subsequent outreach, attendance or adoption.</w:t>
+        <w:t>A5 — Evidence: Annex A5 – Lucena Coordination Meeting. Period / status: Located; dated 5 August 2026; source records contain participant names and meeting transcript details Use in validation: Verifies the 5 August coordination meeting, participation by two identified municipal representatives, discussion of school and urban-garden use cases, municipal dissemination and separate webinar formats for educators and the general public. Does not prove subsequent outreach, attendance or adoption.</w:t>
       </w:r>
     </w:p>
     <w:p>
@@ -5595,7 +5352,7 @@
         <w:spacing w:after="120"/>
       </w:pPr>
       <w:r>
-        <w:t>A6 — Evidence: Outreach emails: mass ANFORA campaign on 24–25 June 2026; direct 27 August invitations including CEP Córdoba and CEIP Barahona de Soto. Period / status: Located / partially verified; some delivery failures documented. Exact 10-school Lucena set not fully recovered. Use in validation: Verifies that the initial campaign exceeded 16 institutions and that specific 27 August educational outreach occurred. The previously reported total of 10 Lucena schools remains only partially verified.</w:t>
+        <w:t>A6 — Evidence: Annex A6 – Outreach Evidence. Period / status: Located / partially verified; some delivery failures documented. Exact 10-school Lucena set not fully recovered. Use in validation: Verifies that the initial campaign exceeded 16 institutions and that specific 27 August educational outreach occurred. The previously reported total of 10 Lucena schools remains only partially verified.</w:t>
       </w:r>
     </w:p>
     <w:p>
@@ -5603,7 +5360,7 @@
         <w:spacing w:after="120"/>
       </w:pPr>
       <w:r>
-        <w:t>A7 — Evidence: Corrected webinar communication; Gemini meeting notes/transcript dated 3 September 2026. Period / status: Delivered 3 September 2026 (post-cut-off); delivery verified. Complete validated attendance register unavailable. Use in validation: Verifies webinar delivery, live demonstration and attendee interaction. Post-cut-off: not counted as an in-period result. Total attendance, satisfaction and learning outcomes remain unverified.</w:t>
+        <w:t>A7 — Evidence: Annex A7 – Educator Webinar Evidence. Period / status: Delivered 3 September 2026 (post-cut-off); delivery verified. Complete validated attendance register unavailable. Use in validation: Verifies webinar delivery, live demonstration and attendee interaction. Post-cut-off: not counted as an in-period result. Total attendance, satisfaction and learning outcomes remain unverified.</w:t>
       </w:r>
     </w:p>
     <w:p>
@@ -5611,7 +5368,7 @@
         <w:spacing w:after="120"/>
       </w:pPr>
       <w:r>
-        <w:t>A8 — Evidence: Indicator-method workbook in Otros plus this revised report and revised data-collection workbook Period / status: Located / updated for mid-validation review Use in validation: Records limitations, unit mismatches and the evidence required for the next measurement cycle.</w:t>
+        <w:t>A8 — Evidence: Indicator-method workbook retained in controlled project storage, plus this revised report and revised data-collection workbook Period / status: Located / updated for mid-validation review Use in validation: Records limitations, unit mismatches and the evidence required for the next measurement cycle.</w:t>
       </w:r>
     </w:p>
     <w:sectPr>
@@ -5657,16 +5414,6 @@
 </file>
 
 <file path=word/footer1.xml><?xml version="1.0" encoding="utf-8"?>
-<w:ftr xmlns:wpc="http://schemas.microsoft.com/office/word/2010/wordprocessingCanvas" xmlns:cx="http://schemas.microsoft.com/office/drawing/2014/chartex" xmlns:cx1="http://schemas.microsoft.com/office/drawing/2015/9/8/chartex" xmlns:cx2="http://schemas.microsoft.com/office/drawing/2015/10/21/chartex" xmlns:cx3="http://schemas.microsoft.com/office/drawing/2016/5/9/chartex" xmlns:cx4="http://schemas.microsoft.com/office/drawing/2016/5/10/chartex" xmlns:cx5="http://schemas.microsoft.com/office/drawing/2016/5/11/chartex" xmlns:cx6="http://schemas.microsoft.com/office/drawing/2016/5/12/chartex" xmlns:cx7="http://schemas.microsoft.com/office/drawing/2016/5/13/chartex" xmlns:cx8="http://schemas.microsoft.com/office/drawing/2016/5/14/chartex" xmlns:mc="http://schemas.openxmlformats.org/markup-compatibility/2006" xmlns:aink="http://schemas.microsoft.com/office/drawing/2016/ink" xmlns:am3d="http://schemas.microsoft.com/office/drawing/2017/model3d" xmlns:o="urn:schemas-microsoft-com:office:office" xmlns:r="http://schemas.openxmlformats.org/officeDocument/2006/relationships" xmlns:m="http://schemas.openxmlformats.org/officeDocument/2006/math" xmlns:v="urn:schemas-microsoft-com:vml" xmlns:wp14="http://schemas.microsoft.com/office/word/2010/wordprocessingDrawing" xmlns:wp="http://schemas.openxmlformats.org/drawingml/2006/wordprocessingDrawing" xmlns:w10="urn:schemas-microsoft-com:office:word" xmlns:w="http://schemas.openxmlformats.org/wordprocessingml/2006/main" xmlns:w14="http://schemas.microsoft.com/office/word/2010/wordml" xmlns:w15="http://schemas.microsoft.com/office/word/2012/wordml" xmlns:w16cex="http://schemas.microsoft.com/office/word/2018/wordml/cex" xmlns:w16cid="http://schemas.microsoft.com/office/word/2016/wordml/cid" xmlns:w16="http://schemas.microsoft.com/office/word/2018/wordml" xmlns:w16sdtdh="http://schemas.microsoft.com/office/word/2020/wordml/sdtdatahash" xmlns:w16se="http://schemas.microsoft.com/office/word/2015/wordml/symex" xmlns:wpg="http://schemas.microsoft.com/office/word/2010/wordprocessingGroup" xmlns:wpi="http://schemas.microsoft.com/office/word/2010/wordprocessingInk" xmlns:wne="http://schemas.microsoft.com/office/word/2006/wordml" xmlns:wps="http://schemas.microsoft.com/office/word/2010/wordprocessingShape" mc:Ignorable="w14 w15 w16se w16cid w16 w16cex w16sdtdh wp14">
-  <w:p>
-    <w:pPr>
-      <w:pStyle w:val="Piedepgina"/>
-    </w:pPr>
-  </w:p>
-</w:ftr>
-</file>
-
-<file path=word/footer2.xml><?xml version="1.0" encoding="utf-8"?>
 <w:ftr xmlns:wpc="http://schemas.microsoft.com/office/word/2010/wordprocessingCanvas" xmlns:cx="http://schemas.microsoft.com/office/drawing/2014/chartex" xmlns:cx1="http://schemas.microsoft.com/office/drawing/2015/9/8/chartex" xmlns:cx2="http://schemas.microsoft.com/office/drawing/2015/10/21/chartex" xmlns:cx3="http://schemas.microsoft.com/office/drawing/2016/5/9/chartex" xmlns:cx4="http://schemas.microsoft.com/office/drawing/2016/5/10/chartex" xmlns:cx5="http://schemas.microsoft.com/office/drawing/2016/5/11/chartex" xmlns:cx6="http://schemas.microsoft.com/office/drawing/2016/5/12/chartex" xmlns:cx7="http://schemas.microsoft.com/office/drawing/2016/5/13/chartex" xmlns:cx8="http://schemas.microsoft.com/office/drawing/2016/5/14/chartex" xmlns:mc="http://schemas.openxmlformats.org/markup-compatibility/2006" xmlns:aink="http://schemas.microsoft.com/office/drawing/2016/ink" xmlns:am3d="http://schemas.microsoft.com/office/drawing/2017/model3d" xmlns:o="urn:schemas-microsoft-com:office:office" xmlns:r="http://schemas.openxmlformats.org/officeDocument/2006/relationships" xmlns:m="http://schemas.openxmlformats.org/officeDocument/2006/math" xmlns:v="urn:schemas-microsoft-com:vml" xmlns:wp14="http://schemas.microsoft.com/office/word/2010/wordprocessingDrawing" xmlns:wp="http://schemas.openxmlformats.org/drawingml/2006/wordprocessingDrawing" xmlns:w10="urn:schemas-microsoft-com:office:word" xmlns:w="http://schemas.openxmlformats.org/wordprocessingml/2006/main" xmlns:w14="http://schemas.microsoft.com/office/word/2010/wordml" xmlns:w15="http://schemas.microsoft.com/office/word/2012/wordml" xmlns:w16cex="http://schemas.microsoft.com/office/word/2018/wordml/cex" xmlns:w16cid="http://schemas.microsoft.com/office/word/2016/wordml/cid" xmlns:w16="http://schemas.microsoft.com/office/word/2018/wordml" xmlns:w16sdtdh="http://schemas.microsoft.com/office/word/2020/wordml/sdtdatahash" xmlns:w16se="http://schemas.microsoft.com/office/word/2015/wordml/symex" xmlns:wpg="http://schemas.microsoft.com/office/word/2010/wordprocessingGroup" xmlns:wpi="http://schemas.microsoft.com/office/word/2010/wordprocessingInk" xmlns:wne="http://schemas.microsoft.com/office/word/2006/wordml" xmlns:wps="http://schemas.microsoft.com/office/word/2010/wordprocessingShape" mc:Ignorable="w14 w15 w16se w16cid w16 w16cex w16sdtdh wp14">
   <w:sdt>
     <w:sdtPr>
@@ -5697,7 +5444,7 @@
 </w:ftr>
 </file>
 
-<file path=word/footer3.xml><?xml version="1.0" encoding="utf-8"?>
+<file path=word/footer2.xml><?xml version="1.0" encoding="utf-8"?>
 <w:ftr xmlns:wpc="http://schemas.microsoft.com/office/word/2010/wordprocessingCanvas" xmlns:cx="http://schemas.microsoft.com/office/drawing/2014/chartex" xmlns:cx1="http://schemas.microsoft.com/office/drawing/2015/9/8/chartex" xmlns:cx2="http://schemas.microsoft.com/office/drawing/2015/10/21/chartex" xmlns:cx3="http://schemas.microsoft.com/office/drawing/2016/5/9/chartex" xmlns:cx4="http://schemas.microsoft.com/office/drawing/2016/5/10/chartex" xmlns:cx5="http://schemas.microsoft.com/office/drawing/2016/5/11/chartex" xmlns:cx6="http://schemas.microsoft.com/office/drawing/2016/5/12/chartex" xmlns:cx7="http://schemas.microsoft.com/office/drawing/2016/5/13/chartex" xmlns:cx8="http://schemas.microsoft.com/office/drawing/2016/5/14/chartex" xmlns:mc="http://schemas.openxmlformats.org/markup-compatibility/2006" xmlns:aink="http://schemas.microsoft.com/office/drawing/2016/ink" xmlns:am3d="http://schemas.microsoft.com/office/drawing/2017/model3d" xmlns:o="urn:schemas-microsoft-com:office:office" xmlns:r="http://schemas.openxmlformats.org/officeDocument/2006/relationships" xmlns:m="http://schemas.openxmlformats.org/officeDocument/2006/math" xmlns:v="urn:schemas-microsoft-com:vml" xmlns:wp14="http://schemas.microsoft.com/office/word/2010/wordprocessingDrawing" xmlns:wp="http://schemas.openxmlformats.org/drawingml/2006/wordprocessingDrawing" xmlns:w10="urn:schemas-microsoft-com:office:word" xmlns:w="http://schemas.openxmlformats.org/wordprocessingml/2006/main" xmlns:w14="http://schemas.microsoft.com/office/word/2010/wordml" xmlns:w15="http://schemas.microsoft.com/office/word/2012/wordml" xmlns:w16cex="http://schemas.microsoft.com/office/word/2018/wordml/cex" xmlns:w16cid="http://schemas.microsoft.com/office/word/2016/wordml/cid" xmlns:w16="http://schemas.microsoft.com/office/word/2018/wordml" xmlns:w16sdtdh="http://schemas.microsoft.com/office/word/2020/wordml/sdtdatahash" xmlns:w16se="http://schemas.microsoft.com/office/word/2015/wordml/symex" xmlns:wpg="http://schemas.microsoft.com/office/word/2010/wordprocessingGroup" xmlns:wpi="http://schemas.microsoft.com/office/word/2010/wordprocessingInk" xmlns:wne="http://schemas.microsoft.com/office/word/2006/wordml" xmlns:wps="http://schemas.microsoft.com/office/word/2010/wordprocessingShape" mc:Ignorable="w14 w15 w16se w16cid w16 w16cex w16sdtdh wp14">
   <w:tbl>
     <w:tblPr>
@@ -5758,7 +5505,7 @@
 </w:ftr>
 </file>
 
-<file path=word/footer4.xml><?xml version="1.0" encoding="utf-8"?>
+<file path=word/footer3.xml><?xml version="1.0" encoding="utf-8"?>
 <w:ftr xmlns:wpc="http://schemas.microsoft.com/office/word/2010/wordprocessingCanvas" xmlns:cx="http://schemas.microsoft.com/office/drawing/2014/chartex" xmlns:cx1="http://schemas.microsoft.com/office/drawing/2015/9/8/chartex" xmlns:cx2="http://schemas.microsoft.com/office/drawing/2015/10/21/chartex" xmlns:cx3="http://schemas.microsoft.com/office/drawing/2016/5/9/chartex" xmlns:cx4="http://schemas.microsoft.com/office/drawing/2016/5/10/chartex" xmlns:cx5="http://schemas.microsoft.com/office/drawing/2016/5/11/chartex" xmlns:cx6="http://schemas.microsoft.com/office/drawing/2016/5/12/chartex" xmlns:cx7="http://schemas.microsoft.com/office/drawing/2016/5/13/chartex" xmlns:cx8="http://schemas.microsoft.com/office/drawing/2016/5/14/chartex" xmlns:mc="http://schemas.openxmlformats.org/markup-compatibility/2006" xmlns:aink="http://schemas.microsoft.com/office/drawing/2016/ink" xmlns:am3d="http://schemas.microsoft.com/office/drawing/2017/model3d" xmlns:o="urn:schemas-microsoft-com:office:office" xmlns:r="http://schemas.openxmlformats.org/officeDocument/2006/relationships" xmlns:m="http://schemas.openxmlformats.org/officeDocument/2006/math" xmlns:v="urn:schemas-microsoft-com:vml" xmlns:wp14="http://schemas.microsoft.com/office/word/2010/wordprocessingDrawing" xmlns:wp="http://schemas.openxmlformats.org/drawingml/2006/wordprocessingDrawing" xmlns:w10="urn:schemas-microsoft-com:office:word" xmlns:w="http://schemas.openxmlformats.org/wordprocessingml/2006/main" xmlns:w14="http://schemas.microsoft.com/office/word/2010/wordml" xmlns:w15="http://schemas.microsoft.com/office/word/2012/wordml" xmlns:w16cex="http://schemas.microsoft.com/office/word/2018/wordml/cex" xmlns:w16cid="http://schemas.microsoft.com/office/word/2016/wordml/cid" xmlns:w16="http://schemas.microsoft.com/office/word/2018/wordml" xmlns:w16sdtdh="http://schemas.microsoft.com/office/word/2020/wordml/sdtdatahash" xmlns:w16se="http://schemas.microsoft.com/office/word/2015/wordml/symex" xmlns:wpg="http://schemas.microsoft.com/office/word/2010/wordprocessingGroup" xmlns:wpi="http://schemas.microsoft.com/office/word/2010/wordprocessingInk" xmlns:wne="http://schemas.microsoft.com/office/word/2006/wordml" xmlns:wps="http://schemas.microsoft.com/office/word/2010/wordprocessingShape" mc:Ignorable="w14 w15 w16se w16cid w16 w16cex w16sdtdh wp14">
   <w:sdt>
     <w:sdtPr>
@@ -5789,7 +5536,7 @@
 </w:ftr>
 </file>
 
-<file path=word/footer5.xml><?xml version="1.0" encoding="utf-8"?>
+<file path=word/footer4.xml><?xml version="1.0" encoding="utf-8"?>
 <w:ftr xmlns:wpc="http://schemas.microsoft.com/office/word/2010/wordprocessingCanvas" xmlns:cx="http://schemas.microsoft.com/office/drawing/2014/chartex" xmlns:cx1="http://schemas.microsoft.com/office/drawing/2015/9/8/chartex" xmlns:cx2="http://schemas.microsoft.com/office/drawing/2015/10/21/chartex" xmlns:cx3="http://schemas.microsoft.com/office/drawing/2016/5/9/chartex" xmlns:cx4="http://schemas.microsoft.com/office/drawing/2016/5/10/chartex" xmlns:cx5="http://schemas.microsoft.com/office/drawing/2016/5/11/chartex" xmlns:cx6="http://schemas.microsoft.com/office/drawing/2016/5/12/chartex" xmlns:cx7="http://schemas.microsoft.com/office/drawing/2016/5/13/chartex" xmlns:cx8="http://schemas.microsoft.com/office/drawing/2016/5/14/chartex" xmlns:mc="http://schemas.openxmlformats.org/markup-compatibility/2006" xmlns:aink="http://schemas.microsoft.com/office/drawing/2016/ink" xmlns:am3d="http://schemas.microsoft.com/office/drawing/2017/model3d" xmlns:o="urn:schemas-microsoft-com:office:office" xmlns:r="http://schemas.openxmlformats.org/officeDocument/2006/relationships" xmlns:m="http://schemas.openxmlformats.org/officeDocument/2006/math" xmlns:v="urn:schemas-microsoft-com:vml" xmlns:wp14="http://schemas.microsoft.com/office/word/2010/wordprocessingDrawing" xmlns:wp="http://schemas.openxmlformats.org/drawingml/2006/wordprocessingDrawing" xmlns:w10="urn:schemas-microsoft-com:office:word" xmlns:w="http://schemas.openxmlformats.org/wordprocessingml/2006/main" xmlns:w14="http://schemas.microsoft.com/office/word/2010/wordml" xmlns:w15="http://schemas.microsoft.com/office/word/2012/wordml" xmlns:w16cex="http://schemas.microsoft.com/office/word/2018/wordml/cex" xmlns:w16cid="http://schemas.microsoft.com/office/word/2016/wordml/cid" xmlns:w16="http://schemas.microsoft.com/office/word/2018/wordml" xmlns:w16sdtdh="http://schemas.microsoft.com/office/word/2020/wordml/sdtdatahash" xmlns:w16se="http://schemas.microsoft.com/office/word/2015/wordml/symex" xmlns:wpg="http://schemas.microsoft.com/office/word/2010/wordprocessingGroup" xmlns:wpi="http://schemas.microsoft.com/office/word/2010/wordprocessingInk" xmlns:wne="http://schemas.microsoft.com/office/word/2006/wordml" xmlns:wps="http://schemas.microsoft.com/office/word/2010/wordprocessingShape" mc:Ignorable="w14 w15 w16se w16cid w16 w16cex w16sdtdh wp14">
   <w:tbl>
     <w:tblPr>
@@ -5850,7 +5597,7 @@
 </w:ftr>
 </file>
 
-<file path=word/footer6.xml><?xml version="1.0" encoding="utf-8"?>
+<file path=word/footer5.xml><?xml version="1.0" encoding="utf-8"?>
 <w:ftr xmlns:wpc="http://schemas.microsoft.com/office/word/2010/wordprocessingCanvas" xmlns:cx="http://schemas.microsoft.com/office/drawing/2014/chartex" xmlns:cx1="http://schemas.microsoft.com/office/drawing/2015/9/8/chartex" xmlns:cx2="http://schemas.microsoft.com/office/drawing/2015/10/21/chartex" xmlns:cx3="http://schemas.microsoft.com/office/drawing/2016/5/9/chartex" xmlns:cx4="http://schemas.microsoft.com/office/drawing/2016/5/10/chartex" xmlns:cx5="http://schemas.microsoft.com/office/drawing/2016/5/11/chartex" xmlns:cx6="http://schemas.microsoft.com/office/drawing/2016/5/12/chartex" xmlns:cx7="http://schemas.microsoft.com/office/drawing/2016/5/13/chartex" xmlns:cx8="http://schemas.microsoft.com/office/drawing/2016/5/14/chartex" xmlns:mc="http://schemas.openxmlformats.org/markup-compatibility/2006" xmlns:aink="http://schemas.microsoft.com/office/drawing/2016/ink" xmlns:am3d="http://schemas.microsoft.com/office/drawing/2017/model3d" xmlns:o="urn:schemas-microsoft-com:office:office" xmlns:r="http://schemas.openxmlformats.org/officeDocument/2006/relationships" xmlns:m="http://schemas.openxmlformats.org/officeDocument/2006/math" xmlns:v="urn:schemas-microsoft-com:vml" xmlns:wp14="http://schemas.microsoft.com/office/word/2010/wordprocessingDrawing" xmlns:wp="http://schemas.openxmlformats.org/drawingml/2006/wordprocessingDrawing" xmlns:w10="urn:schemas-microsoft-com:office:word" xmlns:w="http://schemas.openxmlformats.org/wordprocessingml/2006/main" xmlns:w14="http://schemas.microsoft.com/office/word/2010/wordml" xmlns:w15="http://schemas.microsoft.com/office/word/2012/wordml" xmlns:w16cex="http://schemas.microsoft.com/office/word/2018/wordml/cex" xmlns:w16cid="http://schemas.microsoft.com/office/word/2016/wordml/cid" xmlns:w16="http://schemas.microsoft.com/office/word/2018/wordml" xmlns:w16sdtdh="http://schemas.microsoft.com/office/word/2020/wordml/sdtdatahash" xmlns:w16se="http://schemas.microsoft.com/office/word/2015/wordml/symex" xmlns:wpg="http://schemas.microsoft.com/office/word/2010/wordprocessingGroup" xmlns:wpi="http://schemas.microsoft.com/office/word/2010/wordprocessingInk" xmlns:wne="http://schemas.microsoft.com/office/word/2006/wordml" xmlns:wps="http://schemas.microsoft.com/office/word/2010/wordprocessingShape" mc:Ignorable="w14 w15 w16se w16cid w16 w16cex w16sdtdh wp14">
   <w:sdt>
     <w:sdtPr>
@@ -5888,7 +5635,7 @@
 </w:ftr>
 </file>
 
-<file path=word/footer7.xml><?xml version="1.0" encoding="utf-8"?>
+<file path=word/footer6.xml><?xml version="1.0" encoding="utf-8"?>
 <w:ftr xmlns:wpc="http://schemas.microsoft.com/office/word/2010/wordprocessingCanvas" xmlns:cx="http://schemas.microsoft.com/office/drawing/2014/chartex" xmlns:cx1="http://schemas.microsoft.com/office/drawing/2015/9/8/chartex" xmlns:cx2="http://schemas.microsoft.com/office/drawing/2015/10/21/chartex" xmlns:cx3="http://schemas.microsoft.com/office/drawing/2016/5/9/chartex" xmlns:cx4="http://schemas.microsoft.com/office/drawing/2016/5/10/chartex" xmlns:cx5="http://schemas.microsoft.com/office/drawing/2016/5/11/chartex" xmlns:cx6="http://schemas.microsoft.com/office/drawing/2016/5/12/chartex" xmlns:cx7="http://schemas.microsoft.com/office/drawing/2016/5/13/chartex" xmlns:cx8="http://schemas.microsoft.com/office/drawing/2016/5/14/chartex" xmlns:mc="http://schemas.openxmlformats.org/markup-compatibility/2006" xmlns:aink="http://schemas.microsoft.com/office/drawing/2016/ink" xmlns:am3d="http://schemas.microsoft.com/office/drawing/2017/model3d" xmlns:o="urn:schemas-microsoft-com:office:office" xmlns:r="http://schemas.openxmlformats.org/officeDocument/2006/relationships" xmlns:m="http://schemas.openxmlformats.org/officeDocument/2006/math" xmlns:v="urn:schemas-microsoft-com:vml" xmlns:wp14="http://schemas.microsoft.com/office/word/2010/wordprocessingDrawing" xmlns:wp="http://schemas.openxmlformats.org/drawingml/2006/wordprocessingDrawing" xmlns:w10="urn:schemas-microsoft-com:office:word" xmlns:w="http://schemas.openxmlformats.org/wordprocessingml/2006/main" xmlns:w14="http://schemas.microsoft.com/office/word/2010/wordml" xmlns:w15="http://schemas.microsoft.com/office/word/2012/wordml" xmlns:w16cex="http://schemas.microsoft.com/office/word/2018/wordml/cex" xmlns:w16cid="http://schemas.microsoft.com/office/word/2016/wordml/cid" xmlns:w16="http://schemas.microsoft.com/office/word/2018/wordml" xmlns:w16sdtdh="http://schemas.microsoft.com/office/word/2020/wordml/sdtdatahash" xmlns:w16se="http://schemas.microsoft.com/office/word/2015/wordml/symex" xmlns:wpg="http://schemas.microsoft.com/office/word/2010/wordprocessingGroup" xmlns:wpi="http://schemas.microsoft.com/office/word/2010/wordprocessingInk" xmlns:wne="http://schemas.microsoft.com/office/word/2006/wordml" xmlns:wps="http://schemas.microsoft.com/office/word/2010/wordprocessingShape" mc:Ignorable="w14 w15 w16se w16cid w16 w16cex w16sdtdh wp14">
   <w:tbl>
     <w:tblPr>
@@ -5975,16 +5722,6 @@
 </file>
 
 <file path=word/header1.xml><?xml version="1.0" encoding="utf-8"?>
-<w:hdr xmlns:wpc="http://schemas.microsoft.com/office/word/2010/wordprocessingCanvas" xmlns:cx="http://schemas.microsoft.com/office/drawing/2014/chartex" xmlns:cx1="http://schemas.microsoft.com/office/drawing/2015/9/8/chartex" xmlns:cx2="http://schemas.microsoft.com/office/drawing/2015/10/21/chartex" xmlns:cx3="http://schemas.microsoft.com/office/drawing/2016/5/9/chartex" xmlns:cx4="http://schemas.microsoft.com/office/drawing/2016/5/10/chartex" xmlns:cx5="http://schemas.microsoft.com/office/drawing/2016/5/11/chartex" xmlns:cx6="http://schemas.microsoft.com/office/drawing/2016/5/12/chartex" xmlns:cx7="http://schemas.microsoft.com/office/drawing/2016/5/13/chartex" xmlns:cx8="http://schemas.microsoft.com/office/drawing/2016/5/14/chartex" xmlns:mc="http://schemas.openxmlformats.org/markup-compatibility/2006" xmlns:aink="http://schemas.microsoft.com/office/drawing/2016/ink" xmlns:am3d="http://schemas.microsoft.com/office/drawing/2017/model3d" xmlns:o="urn:schemas-microsoft-com:office:office" xmlns:r="http://schemas.openxmlformats.org/officeDocument/2006/relationships" xmlns:m="http://schemas.openxmlformats.org/officeDocument/2006/math" xmlns:v="urn:schemas-microsoft-com:vml" xmlns:wp14="http://schemas.microsoft.com/office/word/2010/wordprocessingDrawing" xmlns:wp="http://schemas.openxmlformats.org/drawingml/2006/wordprocessingDrawing" xmlns:w10="urn:schemas-microsoft-com:office:word" xmlns:w="http://schemas.openxmlformats.org/wordprocessingml/2006/main" xmlns:w14="http://schemas.microsoft.com/office/word/2010/wordml" xmlns:w15="http://schemas.microsoft.com/office/word/2012/wordml" xmlns:w16cex="http://schemas.microsoft.com/office/word/2018/wordml/cex" xmlns:w16cid="http://schemas.microsoft.com/office/word/2016/wordml/cid" xmlns:w16="http://schemas.microsoft.com/office/word/2018/wordml" xmlns:w16sdtdh="http://schemas.microsoft.com/office/word/2020/wordml/sdtdatahash" xmlns:w16se="http://schemas.microsoft.com/office/word/2015/wordml/symex" xmlns:wpg="http://schemas.microsoft.com/office/word/2010/wordprocessingGroup" xmlns:wpi="http://schemas.microsoft.com/office/word/2010/wordprocessingInk" xmlns:wne="http://schemas.microsoft.com/office/word/2006/wordml" xmlns:wps="http://schemas.microsoft.com/office/word/2010/wordprocessingShape" mc:Ignorable="w14 w15 w16se w16cid w16 w16cex w16sdtdh wp14">
-  <w:p>
-    <w:pPr>
-      <w:pStyle w:val="Encabezado"/>
-    </w:pPr>
-  </w:p>
-</w:hdr>
-</file>
-
-<file path=word/header2.xml><?xml version="1.0" encoding="utf-8"?>
 <w:hdr xmlns:wpc="http://schemas.microsoft.com/office/word/2010/wordprocessingCanvas" xmlns:cx="http://schemas.microsoft.com/office/drawing/2014/chartex" xmlns:cx1="http://schemas.microsoft.com/office/drawing/2015/9/8/chartex" xmlns:cx2="http://schemas.microsoft.com/office/drawing/2015/10/21/chartex" xmlns:cx3="http://schemas.microsoft.com/office/drawing/2016/5/9/chartex" xmlns:cx4="http://schemas.microsoft.com/office/drawing/2016/5/10/chartex" xmlns:cx5="http://schemas.microsoft.com/office/drawing/2016/5/11/chartex" xmlns:cx6="http://schemas.microsoft.com/office/drawing/2016/5/12/chartex" xmlns:cx7="http://schemas.microsoft.com/office/drawing/2016/5/13/chartex" xmlns:cx8="http://schemas.microsoft.com/office/drawing/2016/5/14/chartex" xmlns:mc="http://schemas.openxmlformats.org/markup-compatibility/2006" xmlns:aink="http://schemas.microsoft.com/office/drawing/2016/ink" xmlns:am3d="http://schemas.microsoft.com/office/drawing/2017/model3d" xmlns:o="urn:schemas-microsoft-com:office:office" xmlns:r="http://schemas.openxmlformats.org/officeDocument/2006/relationships" xmlns:m="http://schemas.openxmlformats.org/officeDocument/2006/math" xmlns:v="urn:schemas-microsoft-com:vml" xmlns:wp14="http://schemas.microsoft.com/office/word/2010/wordprocessingDrawing" xmlns:wp="http://schemas.openxmlformats.org/drawingml/2006/wordprocessingDrawing" xmlns:w10="urn:schemas-microsoft-com:office:word" xmlns:w="http://schemas.openxmlformats.org/wordprocessingml/2006/main" xmlns:w14="http://schemas.microsoft.com/office/word/2010/wordml" xmlns:w15="http://schemas.microsoft.com/office/word/2012/wordml" xmlns:w16cex="http://schemas.microsoft.com/office/word/2018/wordml/cex" xmlns:w16cid="http://schemas.microsoft.com/office/word/2016/wordml/cid" xmlns:w16="http://schemas.microsoft.com/office/word/2018/wordml" xmlns:w16sdtdh="http://schemas.microsoft.com/office/word/2020/wordml/sdtdatahash" xmlns:w16se="http://schemas.microsoft.com/office/word/2015/wordml/symex" xmlns:wpg="http://schemas.microsoft.com/office/word/2010/wordprocessingGroup" xmlns:wpi="http://schemas.microsoft.com/office/word/2010/wordprocessingInk" xmlns:wne="http://schemas.microsoft.com/office/word/2006/wordml" xmlns:wps="http://schemas.microsoft.com/office/word/2010/wordprocessingShape" mc:Ignorable="w14 w15 w16se w16cid w16 w16cex w16sdtdh wp14">
   <w:p>
     <w:pPr>
@@ -6066,7 +5803,7 @@
             </wp:anchor>
           </w:drawing>
         </mc:Choice>
-        <mc:Fallback xmlns:oel="http://schemas.microsoft.com/office/2019/extlst" xmlns:w16du="http://schemas.microsoft.com/office/word/2023/wordml/word16du" xmlns:w16sdtfl="http://schemas.microsoft.com/office/word/2024/wordml/sdtformatlock" xmlns:a="http://schemas.openxmlformats.org/drawingml/2006/main">
+        <mc:Fallback xmlns:a="http://schemas.openxmlformats.org/drawingml/2006/main" xmlns:w16sdtfl="http://schemas.microsoft.com/office/word/2024/wordml/sdtformatlock" xmlns:w16du="http://schemas.microsoft.com/office/word/2023/wordml/word16du" xmlns:oel="http://schemas.microsoft.com/office/2019/extlst">
           <w:pict w14:anchorId="6468F0F0">
             <v:rect id="Rectangle 233" style="position:absolute;margin-left:0;margin-top:0;width:580.8pt;height:752.4pt;z-index:251659264;visibility:visible;mso-wrap-style:square;mso-width-percent:950;mso-height-percent:950;mso-wrap-distance-left:9pt;mso-wrap-distance-top:0;mso-wrap-distance-right:9pt;mso-wrap-distance-bottom:0;mso-position-horizontal:center;mso-position-horizontal-relative:page;mso-position-vertical:center;mso-position-vertical-relative:page;mso-width-percent:950;mso-height-percent:950;mso-width-relative:page;mso-height-relative:page;v-text-anchor:middle" o:spid="_x0000_s1026" filled="f" strokecolor="#737373 [1614]" strokeweight="1.25pt" w14:anchorId="37173E84" o:gfxdata="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">
               <w10:wrap anchorx="page" anchory="page"/>
@@ -6127,7 +5864,7 @@
 </w:hdr>
 </file>
 
-<file path=word/header3.xml><?xml version="1.0" encoding="utf-8"?>
+<file path=word/header2.xml><?xml version="1.0" encoding="utf-8"?>
 <w:hdr xmlns:wpc="http://schemas.microsoft.com/office/word/2010/wordprocessingCanvas" xmlns:cx="http://schemas.microsoft.com/office/drawing/2014/chartex" xmlns:cx1="http://schemas.microsoft.com/office/drawing/2015/9/8/chartex" xmlns:cx2="http://schemas.microsoft.com/office/drawing/2015/10/21/chartex" xmlns:cx3="http://schemas.microsoft.com/office/drawing/2016/5/9/chartex" xmlns:cx4="http://schemas.microsoft.com/office/drawing/2016/5/10/chartex" xmlns:cx5="http://schemas.microsoft.com/office/drawing/2016/5/11/chartex" xmlns:cx6="http://schemas.microsoft.com/office/drawing/2016/5/12/chartex" xmlns:cx7="http://schemas.microsoft.com/office/drawing/2016/5/13/chartex" xmlns:cx8="http://schemas.microsoft.com/office/drawing/2016/5/14/chartex" xmlns:mc="http://schemas.openxmlformats.org/markup-compatibility/2006" xmlns:aink="http://schemas.microsoft.com/office/drawing/2016/ink" xmlns:am3d="http://schemas.microsoft.com/office/drawing/2017/model3d" xmlns:o="urn:schemas-microsoft-com:office:office" xmlns:r="http://schemas.openxmlformats.org/officeDocument/2006/relationships" xmlns:m="http://schemas.openxmlformats.org/officeDocument/2006/math" xmlns:v="urn:schemas-microsoft-com:vml" xmlns:wp14="http://schemas.microsoft.com/office/word/2010/wordprocessingDrawing" xmlns:wp="http://schemas.openxmlformats.org/drawingml/2006/wordprocessingDrawing" xmlns:w10="urn:schemas-microsoft-com:office:word" xmlns:w="http://schemas.openxmlformats.org/wordprocessingml/2006/main" xmlns:w14="http://schemas.microsoft.com/office/word/2010/wordml" xmlns:w15="http://schemas.microsoft.com/office/word/2012/wordml" xmlns:w16cex="http://schemas.microsoft.com/office/word/2018/wordml/cex" xmlns:w16cid="http://schemas.microsoft.com/office/word/2016/wordml/cid" xmlns:w16="http://schemas.microsoft.com/office/word/2018/wordml" xmlns:w16sdtdh="http://schemas.microsoft.com/office/word/2020/wordml/sdtdatahash" xmlns:w16se="http://schemas.microsoft.com/office/word/2015/wordml/symex" xmlns:wpg="http://schemas.microsoft.com/office/word/2010/wordprocessingGroup" xmlns:wpi="http://schemas.microsoft.com/office/word/2010/wordprocessingInk" xmlns:wne="http://schemas.microsoft.com/office/word/2006/wordml" xmlns:wps="http://schemas.microsoft.com/office/word/2010/wordprocessingShape" mc:Ignorable="w14 w15 w16se w16cid w16 w16cex w16sdtdh wp14">
   <w:tbl>
     <w:tblPr>
@@ -6188,7 +5925,7 @@
 </w:hdr>
 </file>
 
-<file path=word/header4.xml><?xml version="1.0" encoding="utf-8"?>
+<file path=word/header3.xml><?xml version="1.0" encoding="utf-8"?>
 <w:hdr xmlns:wpc="http://schemas.microsoft.com/office/word/2010/wordprocessingCanvas" xmlns:cx="http://schemas.microsoft.com/office/drawing/2014/chartex" xmlns:cx1="http://schemas.microsoft.com/office/drawing/2015/9/8/chartex" xmlns:cx2="http://schemas.microsoft.com/office/drawing/2015/10/21/chartex" xmlns:cx3="http://schemas.microsoft.com/office/drawing/2016/5/9/chartex" xmlns:cx4="http://schemas.microsoft.com/office/drawing/2016/5/10/chartex" xmlns:cx5="http://schemas.microsoft.com/office/drawing/2016/5/11/chartex" xmlns:cx6="http://schemas.microsoft.com/office/drawing/2016/5/12/chartex" xmlns:cx7="http://schemas.microsoft.com/office/drawing/2016/5/13/chartex" xmlns:cx8="http://schemas.microsoft.com/office/drawing/2016/5/14/chartex" xmlns:mc="http://schemas.openxmlformats.org/markup-compatibility/2006" xmlns:aink="http://schemas.microsoft.com/office/drawing/2016/ink" xmlns:am3d="http://schemas.microsoft.com/office/drawing/2017/model3d" xmlns:o="urn:schemas-microsoft-com:office:office" xmlns:r="http://schemas.openxmlformats.org/officeDocument/2006/relationships" xmlns:m="http://schemas.openxmlformats.org/officeDocument/2006/math" xmlns:v="urn:schemas-microsoft-com:vml" xmlns:wp14="http://schemas.microsoft.com/office/word/2010/wordprocessingDrawing" xmlns:wp="http://schemas.openxmlformats.org/drawingml/2006/wordprocessingDrawing" xmlns:w10="urn:schemas-microsoft-com:office:word" xmlns:w="http://schemas.openxmlformats.org/wordprocessingml/2006/main" xmlns:w14="http://schemas.microsoft.com/office/word/2010/wordml" xmlns:w15="http://schemas.microsoft.com/office/word/2012/wordml" xmlns:w16cex="http://schemas.microsoft.com/office/word/2018/wordml/cex" xmlns:w16cid="http://schemas.microsoft.com/office/word/2016/wordml/cid" xmlns:w16="http://schemas.microsoft.com/office/word/2018/wordml" xmlns:w16sdtdh="http://schemas.microsoft.com/office/word/2020/wordml/sdtdatahash" xmlns:w16se="http://schemas.microsoft.com/office/word/2015/wordml/symex" xmlns:wpg="http://schemas.microsoft.com/office/word/2010/wordprocessingGroup" xmlns:wpi="http://schemas.microsoft.com/office/word/2010/wordprocessingInk" xmlns:wne="http://schemas.microsoft.com/office/word/2006/wordml" xmlns:wps="http://schemas.microsoft.com/office/word/2010/wordprocessingShape" mc:Ignorable="w14 w15 w16se w16cid w16 w16cex w16sdtdh wp14">
   <w:p>
     <w:pPr>
@@ -6311,7 +6048,7 @@
 </w:hdr>
 </file>
 
-<file path=word/header5.xml><?xml version="1.0" encoding="utf-8"?>
+<file path=word/header4.xml><?xml version="1.0" encoding="utf-8"?>
 <w:hdr xmlns:wpc="http://schemas.microsoft.com/office/word/2010/wordprocessingCanvas" xmlns:cx="http://schemas.microsoft.com/office/drawing/2014/chartex" xmlns:cx1="http://schemas.microsoft.com/office/drawing/2015/9/8/chartex" xmlns:cx2="http://schemas.microsoft.com/office/drawing/2015/10/21/chartex" xmlns:cx3="http://schemas.microsoft.com/office/drawing/2016/5/9/chartex" xmlns:cx4="http://schemas.microsoft.com/office/drawing/2016/5/10/chartex" xmlns:cx5="http://schemas.microsoft.com/office/drawing/2016/5/11/chartex" xmlns:cx6="http://schemas.microsoft.com/office/drawing/2016/5/12/chartex" xmlns:cx7="http://schemas.microsoft.com/office/drawing/2016/5/13/chartex" xmlns:cx8="http://schemas.microsoft.com/office/drawing/2016/5/14/chartex" xmlns:mc="http://schemas.openxmlformats.org/markup-compatibility/2006" xmlns:aink="http://schemas.microsoft.com/office/drawing/2016/ink" xmlns:am3d="http://schemas.microsoft.com/office/drawing/2017/model3d" xmlns:o="urn:schemas-microsoft-com:office:office" xmlns:r="http://schemas.openxmlformats.org/officeDocument/2006/relationships" xmlns:m="http://schemas.openxmlformats.org/officeDocument/2006/math" xmlns:v="urn:schemas-microsoft-com:vml" xmlns:wp14="http://schemas.microsoft.com/office/word/2010/wordprocessingDrawing" xmlns:wp="http://schemas.openxmlformats.org/drawingml/2006/wordprocessingDrawing" xmlns:w10="urn:schemas-microsoft-com:office:word" xmlns:w="http://schemas.openxmlformats.org/wordprocessingml/2006/main" xmlns:w14="http://schemas.microsoft.com/office/word/2010/wordml" xmlns:w15="http://schemas.microsoft.com/office/word/2012/wordml" xmlns:w16cex="http://schemas.microsoft.com/office/word/2018/wordml/cex" xmlns:w16cid="http://schemas.microsoft.com/office/word/2016/wordml/cid" xmlns:w16="http://schemas.microsoft.com/office/word/2018/wordml" xmlns:w16sdtdh="http://schemas.microsoft.com/office/word/2020/wordml/sdtdatahash" xmlns:w16se="http://schemas.microsoft.com/office/word/2015/wordml/symex" xmlns:wpg="http://schemas.microsoft.com/office/word/2010/wordprocessingGroup" xmlns:wpi="http://schemas.microsoft.com/office/word/2010/wordprocessingInk" xmlns:wne="http://schemas.microsoft.com/office/word/2006/wordml" xmlns:wps="http://schemas.microsoft.com/office/word/2010/wordprocessingShape" mc:Ignorable="w14 w15 w16se w16cid w16 w16cex w16sdtdh wp14">
   <w:tbl>
     <w:tblPr>
@@ -6372,7 +6109,7 @@
 </w:hdr>
 </file>
 
-<file path=word/header6.xml><?xml version="1.0" encoding="utf-8"?>
+<file path=word/header5.xml><?xml version="1.0" encoding="utf-8"?>
 <w:hdr xmlns:wpc="http://schemas.microsoft.com/office/word/2010/wordprocessingCanvas" xmlns:cx="http://schemas.microsoft.com/office/drawing/2014/chartex" xmlns:cx1="http://schemas.microsoft.com/office/drawing/2015/9/8/chartex" xmlns:cx2="http://schemas.microsoft.com/office/drawing/2015/10/21/chartex" xmlns:cx3="http://schemas.microsoft.com/office/drawing/2016/5/9/chartex" xmlns:cx4="http://schemas.microsoft.com/office/drawing/2016/5/10/chartex" xmlns:cx5="http://schemas.microsoft.com/office/drawing/2016/5/11/chartex" xmlns:cx6="http://schemas.microsoft.com/office/drawing/2016/5/12/chartex" xmlns:cx7="http://schemas.microsoft.com/office/drawing/2016/5/13/chartex" xmlns:cx8="http://schemas.microsoft.com/office/drawing/2016/5/14/chartex" xmlns:mc="http://schemas.openxmlformats.org/markup-compatibility/2006" xmlns:aink="http://schemas.microsoft.com/office/drawing/2016/ink" xmlns:am3d="http://schemas.microsoft.com/office/drawing/2017/model3d" xmlns:o="urn:schemas-microsoft-com:office:office" xmlns:r="http://schemas.openxmlformats.org/officeDocument/2006/relationships" xmlns:m="http://schemas.openxmlformats.org/officeDocument/2006/math" xmlns:v="urn:schemas-microsoft-com:vml" xmlns:wp14="http://schemas.microsoft.com/office/word/2010/wordprocessingDrawing" xmlns:wp="http://schemas.openxmlformats.org/drawingml/2006/wordprocessingDrawing" xmlns:w10="urn:schemas-microsoft-com:office:word" xmlns:w="http://schemas.openxmlformats.org/wordprocessingml/2006/main" xmlns:w14="http://schemas.microsoft.com/office/word/2010/wordml" xmlns:w15="http://schemas.microsoft.com/office/word/2012/wordml" xmlns:w16cex="http://schemas.microsoft.com/office/word/2018/wordml/cex" xmlns:w16cid="http://schemas.microsoft.com/office/word/2016/wordml/cid" xmlns:w16="http://schemas.microsoft.com/office/word/2018/wordml" xmlns:w16sdtdh="http://schemas.microsoft.com/office/word/2020/wordml/sdtdatahash" xmlns:w16se="http://schemas.microsoft.com/office/word/2015/wordml/symex" xmlns:wpg="http://schemas.microsoft.com/office/word/2010/wordprocessingGroup" xmlns:wpi="http://schemas.microsoft.com/office/word/2010/wordprocessingInk" xmlns:wne="http://schemas.microsoft.com/office/word/2006/wordml" xmlns:wps="http://schemas.microsoft.com/office/word/2010/wordprocessingShape" mc:Ignorable="w14 w15 w16se w16cid w16 w16cex w16sdtdh wp14">
   <w:tbl>
     <w:tblPr>
@@ -7827,10 +7564,6 @@
 </file>
 
 <file path=customXml/item1.xml><?xml version="1.0" encoding="utf-8"?>
-<b:Sources xmlns:b="http://schemas.openxmlformats.org/officeDocument/2006/bibliography" xmlns="http://schemas.openxmlformats.org/officeDocument/2006/bibliography" SelectedStyle="\APASixthEditionOfficeOnline.xsl" StyleName="APA" Version="6"/>
-</file>
-
-<file path=customXml/item2.xml><?xml version="1.0" encoding="utf-8"?>
 <p:properties xmlns:p="http://schemas.microsoft.com/office/2006/metadata/properties" xmlns:xsi="http://www.w3.org/2001/XMLSchema-instance" xmlns:pc="http://schemas.microsoft.com/office/infopath/2007/PartnerControls">
   <documentManagement>
     <TranslatedLang xmlns="55fa6559-6548-493a-bddc-9eba090e1cd4" xsi:nil="true"/>
@@ -7843,16 +7576,11 @@
 </p:properties>
 </file>
 
-<file path=customXml/item3.xml><?xml version="1.0" encoding="utf-8"?>
-<?mso-contentType ?>
-<FormTemplates xmlns="http://schemas.microsoft.com/sharepoint/v3/contenttype/forms">
-  <Display>DocumentLibraryForm</Display>
-  <Edit>DocumentLibraryForm</Edit>
-  <New>DocumentLibraryForm</New>
-</FormTemplates>
+<file path=customXml/item2.xml><?xml version="1.0" encoding="utf-8"?>
+<b:Sources xmlns:b="http://schemas.openxmlformats.org/officeDocument/2006/bibliography" xmlns="http://schemas.openxmlformats.org/officeDocument/2006/bibliography" SelectedStyle="\APASixthEditionOfficeOnline.xsl" StyleName="APA" Version="6"/>
 </file>
 
-<file path=customXml/item4.xml><?xml version="1.0" encoding="utf-8"?>
+<file path=customXml/item3.xml><?xml version="1.0" encoding="utf-8"?>
 <ct:contentTypeSchema xmlns:ct="http://schemas.microsoft.com/office/2006/metadata/contentType" xmlns:ma="http://schemas.microsoft.com/office/2006/metadata/properties/metaAttributes" ct:_="" ma:_="" ma:contentTypeName="Document" ma:contentTypeID="0x010100F95E66836DC97340ABDAAF1455FC752E" ma:contentTypeVersion="18" ma:contentTypeDescription="Create a new document." ma:contentTypeScope="" ma:versionID="10ea6731051b7bc32a652ff7d9fd149d">
   <xsd:schema xmlns:xsd="http://www.w3.org/2001/XMLSchema" xmlns:xs="http://www.w3.org/2001/XMLSchema" xmlns:p="http://schemas.microsoft.com/office/2006/metadata/properties" xmlns:ns2="55fa6559-6548-493a-bddc-9eba090e1cd4" xmlns:ns3="e07ec2dc-b44d-4cb9-bd12-5a2a513b4fbd" targetNamespace="http://schemas.microsoft.com/office/2006/metadata/properties" ma:root="true" ma:fieldsID="094bcc526e6a4992a9a84b953f5a8ec0" ns2:_="" ns3:_="">
     <xsd:import namespace="55fa6559-6548-493a-bddc-9eba090e1cd4"/>
@@ -8107,15 +7835,16 @@
 </ct:contentTypeSchema>
 </file>
 
-<file path=customXml/itemProps1.xml><?xml version="1.0" encoding="utf-8"?>
-<ds:datastoreItem xmlns:ds="http://schemas.openxmlformats.org/officeDocument/2006/customXml" ds:itemID="{532F8640-4578-43E0-B025-AE4F85A6B19F}">
-  <ds:schemaRefs>
-    <ds:schemaRef ds:uri="http://schemas.openxmlformats.org/officeDocument/2006/bibliography"/>
-  </ds:schemaRefs>
-</ds:datastoreItem>
+<file path=customXml/item4.xml><?xml version="1.0" encoding="utf-8"?>
+<?mso-contentType ?>
+<FormTemplates xmlns="http://schemas.microsoft.com/sharepoint/v3/contenttype/forms">
+  <Display>DocumentLibraryForm</Display>
+  <Edit>DocumentLibraryForm</Edit>
+  <New>DocumentLibraryForm</New>
+</FormTemplates>
 </file>
 
-<file path=customXml/itemProps2.xml><?xml version="1.0" encoding="utf-8"?>
+<file path=customXml/itemProps1.xml><?xml version="1.0" encoding="utf-8"?>
 <ds:datastoreItem xmlns:ds="http://schemas.openxmlformats.org/officeDocument/2006/customXml" ds:itemID="{AFDFD593-933C-43BE-98F5-5C5B7E88BDC6}">
   <ds:schemaRefs>
     <ds:schemaRef ds:uri="http://schemas.microsoft.com/office/2006/metadata/properties"/>
@@ -8126,15 +7855,15 @@
 </ds:datastoreItem>
 </file>
 
-<file path=customXml/itemProps3.xml><?xml version="1.0" encoding="utf-8"?>
-<ds:datastoreItem xmlns:ds="http://schemas.openxmlformats.org/officeDocument/2006/customXml" ds:itemID="{58FDF39A-306E-423E-A34B-2015B5072F5C}">
+<file path=customXml/itemProps2.xml><?xml version="1.0" encoding="utf-8"?>
+<ds:datastoreItem xmlns:ds="http://schemas.openxmlformats.org/officeDocument/2006/customXml" ds:itemID="{532F8640-4578-43E0-B025-AE4F85A6B19F}">
   <ds:schemaRefs>
-    <ds:schemaRef ds:uri="http://schemas.microsoft.com/sharepoint/v3/contenttype/forms"/>
+    <ds:schemaRef ds:uri="http://schemas.openxmlformats.org/officeDocument/2006/bibliography"/>
   </ds:schemaRefs>
 </ds:datastoreItem>
 </file>
 
-<file path=customXml/itemProps4.xml><?xml version="1.0" encoding="utf-8"?>
+<file path=customXml/itemProps3.xml><?xml version="1.0" encoding="utf-8"?>
 <ds:datastoreItem xmlns:ds="http://schemas.openxmlformats.org/officeDocument/2006/customXml" ds:itemID="{7B014B28-67A9-4A43-86E3-256BD0560258}">
   <ds:schemaRefs>
     <ds:schemaRef ds:uri="http://schemas.microsoft.com/office/2006/metadata/contentType"/>
@@ -8151,4 +7880,12 @@
     <ds:schemaRef ds:uri="http://schemas.microsoft.com/internal/obd"/>
   </ds:schemaRefs>
 </ds:datastoreItem>
+</file>
+
+<file path=customXml/itemProps4.xml><?xml version="1.0" encoding="utf-8"?>
+<ds:datastoreItem xmlns:ds="http://schemas.openxmlformats.org/officeDocument/2006/customXml" ds:itemID="{58FDF39A-306E-423E-A34B-2015B5072F5C}">
+  <ds:schemaRefs>
+    <ds:schemaRef ds:uri="http://schemas.microsoft.com/sharepoint/v3/contenttype/forms"/>
+  </ds:schemaRefs>
+</ds:datastoreItem>
 </file>
</xml_diff>